<commit_message>
adding explanations to EDA and working on feature selection and data splitting
</commit_message>
<xml_diff>
--- a/docs/Domian Understanding.docx
+++ b/docs/Domian Understanding.docx
@@ -247,6 +247,7 @@
                                         <w:szCs w:val="24"/>
                                       </w:rPr>
                                     </w:pPr>
+                                    <w:proofErr w:type="gramStart"/>
                                     <w:r>
                                       <w:rPr>
                                         <w:caps/>
@@ -254,7 +255,17 @@
                                         <w:sz w:val="24"/>
                                         <w:szCs w:val="24"/>
                                       </w:rPr>
-                                      <w:t>Slavova,Katerina K.S.</w:t>
+                                      <w:t>Slavova,Katerina</w:t>
+                                    </w:r>
+                                    <w:proofErr w:type="gramEnd"/>
+                                    <w:r>
+                                      <w:rPr>
+                                        <w:caps/>
+                                        <w:color w:val="5B9BD5" w:themeColor="accent5"/>
+                                        <w:sz w:val="24"/>
+                                        <w:szCs w:val="24"/>
+                                      </w:rPr>
+                                      <w:t xml:space="preserve"> K.S.</w:t>
                                     </w:r>
                                   </w:p>
                                 </w:sdtContent>
@@ -3192,7 +3203,35 @@
           <w:sz w:val="36"/>
           <w:szCs w:val="36"/>
         </w:rPr>
-        <w:t>How BERT processes the input?</w:t>
+        <w:t xml:space="preserve">How </w:t>
+      </w:r>
+      <w:r>
+        <w:rPr>
+          <w:sz w:val="36"/>
+          <w:szCs w:val="36"/>
+        </w:rPr>
+        <w:t xml:space="preserve">does </w:t>
+      </w:r>
+      <w:r>
+        <w:rPr>
+          <w:sz w:val="36"/>
+          <w:szCs w:val="36"/>
+        </w:rPr>
+        <w:t xml:space="preserve">BERT </w:t>
+      </w:r>
+      <w:r>
+        <w:rPr>
+          <w:sz w:val="36"/>
+          <w:szCs w:val="36"/>
+        </w:rPr>
+        <w:t>process</w:t>
+      </w:r>
+      <w:r>
+        <w:rPr>
+          <w:sz w:val="36"/>
+          <w:szCs w:val="36"/>
+        </w:rPr>
+        <w:t xml:space="preserve"> the input?</w:t>
       </w:r>
       <w:bookmarkEnd w:id="14"/>
     </w:p>
@@ -4332,12 +4371,21 @@
         </w:rPr>
         <w:t xml:space="preserve">a </w:t>
       </w:r>
-      <w:r>
-        <w:rPr>
-          <w:sz w:val="28"/>
-          <w:szCs w:val="28"/>
-        </w:rPr>
-        <w:t>Social Media Listening tool that</w:t>
+      <w:proofErr w:type="gramStart"/>
+      <w:r>
+        <w:rPr>
+          <w:sz w:val="28"/>
+          <w:szCs w:val="28"/>
+        </w:rPr>
+        <w:t>Social Media</w:t>
+      </w:r>
+      <w:proofErr w:type="gramEnd"/>
+      <w:r>
+        <w:rPr>
+          <w:sz w:val="28"/>
+          <w:szCs w:val="28"/>
+        </w:rPr>
+        <w:t xml:space="preserve"> Listening tool that</w:t>
       </w:r>
       <w:r>
         <w:rPr>
@@ -5253,7 +5301,23 @@
           <w:i/>
           <w:iCs/>
         </w:rPr>
-        <w:t>How the Red Cross Uses Social Media for Disaster Response and Engaging Donors</w:t>
+        <w:t xml:space="preserve">How the Red Cross Uses </w:t>
+      </w:r>
+      <w:proofErr w:type="gramStart"/>
+      <w:r>
+        <w:rPr>
+          <w:i/>
+          <w:iCs/>
+        </w:rPr>
+        <w:t>Social Media</w:t>
+      </w:r>
+      <w:proofErr w:type="gramEnd"/>
+      <w:r>
+        <w:rPr>
+          <w:i/>
+          <w:iCs/>
+        </w:rPr>
+        <w:t xml:space="preserve"> for Disaster Response and Engaging Donors</w:t>
       </w:r>
       <w:r>
         <w:t xml:space="preserve">. (2015, April 21). Medium. </w:t>

</xml_diff>

<commit_message>
adjusting domain understanding, fixing data provisioning and implementing Logistic regression
</commit_message>
<xml_diff>
--- a/docs/Domian Understanding.docx
+++ b/docs/Domian Understanding.docx
@@ -401,6 +401,7 @@
                                   <w:szCs w:val="24"/>
                                 </w:rPr>
                               </w:pPr>
+                              <w:proofErr w:type="gramStart"/>
                               <w:r>
                                 <w:rPr>
                                   <w:caps/>
@@ -408,7 +409,17 @@
                                   <w:sz w:val="24"/>
                                   <w:szCs w:val="24"/>
                                 </w:rPr>
-                                <w:t>Slavova,Katerina K.S.</w:t>
+                                <w:t>Slavova,Katerina</w:t>
+                              </w:r>
+                              <w:proofErr w:type="gramEnd"/>
+                              <w:r>
+                                <w:rPr>
+                                  <w:caps/>
+                                  <w:color w:val="5B9BD5" w:themeColor="accent5"/>
+                                  <w:sz w:val="24"/>
+                                  <w:szCs w:val="24"/>
+                                </w:rPr>
+                                <w:t xml:space="preserve"> K.S.</w:t>
                               </w:r>
                             </w:p>
                           </w:sdtContent>
@@ -658,7 +669,7 @@
               <w:r>
                 <w:fldChar w:fldCharType="separate"/>
               </w:r>
-              <w:hyperlink w:anchor="_Toc215832366" w:history="1">
+              <w:hyperlink w:anchor="_Toc216749814" w:history="1">
                 <w:r>
                   <w:rPr>
                     <w:rStyle w:val="Hyperlink"/>
@@ -685,7 +696,7 @@
                     <w:noProof/>
                     <w:webHidden/>
                   </w:rPr>
-                  <w:instrText xml:space="preserve"> PAGEREF _Toc215832366 \h </w:instrText>
+                  <w:instrText xml:space="preserve"> PAGEREF _Toc216749814 \h </w:instrText>
                 </w:r>
                 <w:r>
                   <w:rPr>
@@ -727,7 +738,7 @@
                   <w:noProof/>
                 </w:rPr>
               </w:pPr>
-              <w:hyperlink w:anchor="_Toc215832367" w:history="1">
+              <w:hyperlink w:anchor="_Toc216749815" w:history="1">
                 <w:r>
                   <w:rPr>
                     <w:rStyle w:val="Hyperlink"/>
@@ -754,7 +765,7 @@
                     <w:noProof/>
                     <w:webHidden/>
                   </w:rPr>
-                  <w:instrText xml:space="preserve"> PAGEREF _Toc215832367 \h </w:instrText>
+                  <w:instrText xml:space="preserve"> PAGEREF _Toc216749815 \h </w:instrText>
                 </w:r>
                 <w:r>
                   <w:rPr>
@@ -796,7 +807,7 @@
                   <w:noProof/>
                 </w:rPr>
               </w:pPr>
-              <w:hyperlink w:anchor="_Toc215832368" w:history="1">
+              <w:hyperlink w:anchor="_Toc216749816" w:history="1">
                 <w:r>
                   <w:rPr>
                     <w:rStyle w:val="Hyperlink"/>
@@ -823,7 +834,7 @@
                     <w:noProof/>
                     <w:webHidden/>
                   </w:rPr>
-                  <w:instrText xml:space="preserve"> PAGEREF _Toc215832368 \h </w:instrText>
+                  <w:instrText xml:space="preserve"> PAGEREF _Toc216749816 \h </w:instrText>
                 </w:r>
                 <w:r>
                   <w:rPr>
@@ -865,7 +876,7 @@
                   <w:noProof/>
                 </w:rPr>
               </w:pPr>
-              <w:hyperlink w:anchor="_Toc215832369" w:history="1">
+              <w:hyperlink w:anchor="_Toc216749817" w:history="1">
                 <w:r>
                   <w:rPr>
                     <w:rStyle w:val="Hyperlink"/>
@@ -892,7 +903,7 @@
                     <w:noProof/>
                     <w:webHidden/>
                   </w:rPr>
-                  <w:instrText xml:space="preserve"> PAGEREF _Toc215832369 \h </w:instrText>
+                  <w:instrText xml:space="preserve"> PAGEREF _Toc216749817 \h </w:instrText>
                 </w:r>
                 <w:r>
                   <w:rPr>
@@ -934,7 +945,7 @@
                   <w:noProof/>
                 </w:rPr>
               </w:pPr>
-              <w:hyperlink w:anchor="_Toc215832370" w:history="1">
+              <w:hyperlink w:anchor="_Toc216749818" w:history="1">
                 <w:r>
                   <w:rPr>
                     <w:rStyle w:val="Hyperlink"/>
@@ -961,7 +972,7 @@
                     <w:noProof/>
                     <w:webHidden/>
                   </w:rPr>
-                  <w:instrText xml:space="preserve"> PAGEREF _Toc215832370 \h </w:instrText>
+                  <w:instrText xml:space="preserve"> PAGEREF _Toc216749818 \h </w:instrText>
                 </w:r>
                 <w:r>
                   <w:rPr>
@@ -1003,7 +1014,7 @@
                   <w:noProof/>
                 </w:rPr>
               </w:pPr>
-              <w:hyperlink w:anchor="_Toc215832371" w:history="1">
+              <w:hyperlink w:anchor="_Toc216749819" w:history="1">
                 <w:r>
                   <w:rPr>
                     <w:rStyle w:val="Hyperlink"/>
@@ -1030,7 +1041,7 @@
                     <w:noProof/>
                     <w:webHidden/>
                   </w:rPr>
-                  <w:instrText xml:space="preserve"> PAGEREF _Toc215832371 \h </w:instrText>
+                  <w:instrText xml:space="preserve"> PAGEREF _Toc216749819 \h </w:instrText>
                 </w:r>
                 <w:r>
                   <w:rPr>
@@ -1072,7 +1083,7 @@
                   <w:noProof/>
                 </w:rPr>
               </w:pPr>
-              <w:hyperlink w:anchor="_Toc215832372" w:history="1">
+              <w:hyperlink w:anchor="_Toc216749820" w:history="1">
                 <w:r>
                   <w:rPr>
                     <w:rStyle w:val="Hyperlink"/>
@@ -1099,7 +1110,7 @@
                     <w:noProof/>
                     <w:webHidden/>
                   </w:rPr>
-                  <w:instrText xml:space="preserve"> PAGEREF _Toc215832372 \h </w:instrText>
+                  <w:instrText xml:space="preserve"> PAGEREF _Toc216749820 \h </w:instrText>
                 </w:r>
                 <w:r>
                   <w:rPr>
@@ -1141,7 +1152,7 @@
                   <w:noProof/>
                 </w:rPr>
               </w:pPr>
-              <w:hyperlink w:anchor="_Toc215832373" w:history="1">
+              <w:hyperlink w:anchor="_Toc216749821" w:history="1">
                 <w:r>
                   <w:rPr>
                     <w:rStyle w:val="Hyperlink"/>
@@ -1168,7 +1179,7 @@
                     <w:noProof/>
                     <w:webHidden/>
                   </w:rPr>
-                  <w:instrText xml:space="preserve"> PAGEREF _Toc215832373 \h </w:instrText>
+                  <w:instrText xml:space="preserve"> PAGEREF _Toc216749821 \h </w:instrText>
                 </w:r>
                 <w:r>
                   <w:rPr>
@@ -1210,7 +1221,7 @@
                   <w:noProof/>
                 </w:rPr>
               </w:pPr>
-              <w:hyperlink w:anchor="_Toc215832374" w:history="1">
+              <w:hyperlink w:anchor="_Toc216749822" w:history="1">
                 <w:r>
                   <w:rPr>
                     <w:rStyle w:val="Hyperlink"/>
@@ -1237,7 +1248,7 @@
                     <w:noProof/>
                     <w:webHidden/>
                   </w:rPr>
-                  <w:instrText xml:space="preserve"> PAGEREF _Toc215832374 \h </w:instrText>
+                  <w:instrText xml:space="preserve"> PAGEREF _Toc216749822 \h </w:instrText>
                 </w:r>
                 <w:r>
                   <w:rPr>
@@ -1279,7 +1290,7 @@
                   <w:noProof/>
                 </w:rPr>
               </w:pPr>
-              <w:hyperlink w:anchor="_Toc215832375" w:history="1">
+              <w:hyperlink w:anchor="_Toc216749823" w:history="1">
                 <w:r>
                   <w:rPr>
                     <w:rStyle w:val="Hyperlink"/>
@@ -1306,7 +1317,7 @@
                     <w:noProof/>
                     <w:webHidden/>
                   </w:rPr>
-                  <w:instrText xml:space="preserve"> PAGEREF _Toc215832375 \h </w:instrText>
+                  <w:instrText xml:space="preserve"> PAGEREF _Toc216749823 \h </w:instrText>
                 </w:r>
                 <w:r>
                   <w:rPr>
@@ -1348,7 +1359,7 @@
                   <w:noProof/>
                 </w:rPr>
               </w:pPr>
-              <w:hyperlink w:anchor="_Toc215832376" w:history="1">
+              <w:hyperlink w:anchor="_Toc216749824" w:history="1">
                 <w:r>
                   <w:rPr>
                     <w:rStyle w:val="Hyperlink"/>
@@ -1375,7 +1386,7 @@
                     <w:noProof/>
                     <w:webHidden/>
                   </w:rPr>
-                  <w:instrText xml:space="preserve"> PAGEREF _Toc215832376 \h </w:instrText>
+                  <w:instrText xml:space="preserve"> PAGEREF _Toc216749824 \h </w:instrText>
                 </w:r>
                 <w:r>
                   <w:rPr>
@@ -1417,13 +1428,13 @@
                   <w:noProof/>
                 </w:rPr>
               </w:pPr>
-              <w:hyperlink w:anchor="_Toc215832377" w:history="1">
+              <w:hyperlink w:anchor="_Toc216749825" w:history="1">
                 <w:r>
                   <w:rPr>
                     <w:rStyle w:val="Hyperlink"/>
                     <w:noProof/>
                   </w:rPr>
-                  <w:t>BERT</w:t>
+                  <w:t>Natural Language Processing</w:t>
                 </w:r>
                 <w:r>
                   <w:rPr>
@@ -1444,7 +1455,7 @@
                     <w:noProof/>
                     <w:webHidden/>
                   </w:rPr>
-                  <w:instrText xml:space="preserve"> PAGEREF _Toc215832377 \h </w:instrText>
+                  <w:instrText xml:space="preserve"> PAGEREF _Toc216749825 \h </w:instrText>
                 </w:r>
                 <w:r>
                   <w:rPr>
@@ -1486,13 +1497,13 @@
                   <w:noProof/>
                 </w:rPr>
               </w:pPr>
-              <w:hyperlink w:anchor="_Toc215832378" w:history="1">
+              <w:hyperlink w:anchor="_Toc216749826" w:history="1">
                 <w:r>
                   <w:rPr>
                     <w:rStyle w:val="Hyperlink"/>
                     <w:noProof/>
                   </w:rPr>
-                  <w:t>What is BERT?</w:t>
+                  <w:t>What is NLP?</w:t>
                 </w:r>
                 <w:r>
                   <w:rPr>
@@ -1513,7 +1524,7 @@
                     <w:noProof/>
                     <w:webHidden/>
                   </w:rPr>
-                  <w:instrText xml:space="preserve"> PAGEREF _Toc215832378 \h </w:instrText>
+                  <w:instrText xml:space="preserve"> PAGEREF _Toc216749826 \h </w:instrText>
                 </w:r>
                 <w:r>
                   <w:rPr>
@@ -1555,13 +1566,13 @@
                   <w:noProof/>
                 </w:rPr>
               </w:pPr>
-              <w:hyperlink w:anchor="_Toc215832379" w:history="1">
+              <w:hyperlink w:anchor="_Toc216749827" w:history="1">
                 <w:r>
                   <w:rPr>
                     <w:rStyle w:val="Hyperlink"/>
                     <w:noProof/>
                   </w:rPr>
-                  <w:t>BERT-based models</w:t>
+                  <w:t>Key concepts of NLP</w:t>
                 </w:r>
                 <w:r>
                   <w:rPr>
@@ -1582,7 +1593,7 @@
                     <w:noProof/>
                     <w:webHidden/>
                   </w:rPr>
-                  <w:instrText xml:space="preserve"> PAGEREF _Toc215832379 \h </w:instrText>
+                  <w:instrText xml:space="preserve"> PAGEREF _Toc216749827 \h </w:instrText>
                 </w:r>
                 <w:r>
                   <w:rPr>
@@ -1624,13 +1635,13 @@
                   <w:noProof/>
                 </w:rPr>
               </w:pPr>
-              <w:hyperlink w:anchor="_Toc215832380" w:history="1">
+              <w:hyperlink w:anchor="_Toc216749828" w:history="1">
                 <w:r>
                   <w:rPr>
                     <w:rStyle w:val="Hyperlink"/>
                     <w:noProof/>
                   </w:rPr>
-                  <w:t>How BERT processes the input?</w:t>
+                  <w:t>How does NLP work?</w:t>
                 </w:r>
                 <w:r>
                   <w:rPr>
@@ -1651,7 +1662,7 @@
                     <w:noProof/>
                     <w:webHidden/>
                   </w:rPr>
-                  <w:instrText xml:space="preserve"> PAGEREF _Toc215832380 \h </w:instrText>
+                  <w:instrText xml:space="preserve"> PAGEREF _Toc216749828 \h </w:instrText>
                 </w:r>
                 <w:r>
                   <w:rPr>
@@ -1671,7 +1682,352 @@
                     <w:noProof/>
                     <w:webHidden/>
                   </w:rPr>
-                  <w:t>4</w:t>
+                  <w:t>5</w:t>
+                </w:r>
+                <w:r>
+                  <w:rPr>
+                    <w:noProof/>
+                    <w:webHidden/>
+                  </w:rPr>
+                  <w:fldChar w:fldCharType="end"/>
+                </w:r>
+              </w:hyperlink>
+            </w:p>
+            <w:p>
+              <w:pPr>
+                <w:pStyle w:val="TOC2"/>
+                <w:tabs>
+                  <w:tab w:val="right" w:leader="dot" w:pos="9350"/>
+                </w:tabs>
+                <w:rPr>
+                  <w:rFonts w:eastAsiaTheme="minorEastAsia"/>
+                  <w:noProof/>
+                </w:rPr>
+              </w:pPr>
+              <w:hyperlink w:anchor="_Toc216749829" w:history="1">
+                <w:r>
+                  <w:rPr>
+                    <w:rStyle w:val="Hyperlink"/>
+                    <w:noProof/>
+                  </w:rPr>
+                  <w:t>Understanding the difference between Human Language Processing and NLP</w:t>
+                </w:r>
+                <w:r>
+                  <w:rPr>
+                    <w:noProof/>
+                    <w:webHidden/>
+                  </w:rPr>
+                  <w:tab/>
+                </w:r>
+                <w:r>
+                  <w:rPr>
+                    <w:noProof/>
+                    <w:webHidden/>
+                  </w:rPr>
+                  <w:fldChar w:fldCharType="begin"/>
+                </w:r>
+                <w:r>
+                  <w:rPr>
+                    <w:noProof/>
+                    <w:webHidden/>
+                  </w:rPr>
+                  <w:instrText xml:space="preserve"> PAGEREF _Toc216749829 \h </w:instrText>
+                </w:r>
+                <w:r>
+                  <w:rPr>
+                    <w:noProof/>
+                    <w:webHidden/>
+                  </w:rPr>
+                </w:r>
+                <w:r>
+                  <w:rPr>
+                    <w:noProof/>
+                    <w:webHidden/>
+                  </w:rPr>
+                  <w:fldChar w:fldCharType="separate"/>
+                </w:r>
+                <w:r>
+                  <w:rPr>
+                    <w:noProof/>
+                    <w:webHidden/>
+                  </w:rPr>
+                  <w:t>7</w:t>
+                </w:r>
+                <w:r>
+                  <w:rPr>
+                    <w:noProof/>
+                    <w:webHidden/>
+                  </w:rPr>
+                  <w:fldChar w:fldCharType="end"/>
+                </w:r>
+              </w:hyperlink>
+            </w:p>
+            <w:p>
+              <w:pPr>
+                <w:pStyle w:val="TOC1"/>
+                <w:tabs>
+                  <w:tab w:val="right" w:leader="dot" w:pos="9350"/>
+                </w:tabs>
+                <w:rPr>
+                  <w:rFonts w:eastAsiaTheme="minorEastAsia"/>
+                  <w:noProof/>
+                </w:rPr>
+              </w:pPr>
+              <w:hyperlink w:anchor="_Toc216749830" w:history="1">
+                <w:r>
+                  <w:rPr>
+                    <w:rStyle w:val="Hyperlink"/>
+                    <w:noProof/>
+                  </w:rPr>
+                  <w:t>BERT</w:t>
+                </w:r>
+                <w:r>
+                  <w:rPr>
+                    <w:noProof/>
+                    <w:webHidden/>
+                  </w:rPr>
+                  <w:tab/>
+                </w:r>
+                <w:r>
+                  <w:rPr>
+                    <w:noProof/>
+                    <w:webHidden/>
+                  </w:rPr>
+                  <w:fldChar w:fldCharType="begin"/>
+                </w:r>
+                <w:r>
+                  <w:rPr>
+                    <w:noProof/>
+                    <w:webHidden/>
+                  </w:rPr>
+                  <w:instrText xml:space="preserve"> PAGEREF _Toc216749830 \h </w:instrText>
+                </w:r>
+                <w:r>
+                  <w:rPr>
+                    <w:noProof/>
+                    <w:webHidden/>
+                  </w:rPr>
+                </w:r>
+                <w:r>
+                  <w:rPr>
+                    <w:noProof/>
+                    <w:webHidden/>
+                  </w:rPr>
+                  <w:fldChar w:fldCharType="separate"/>
+                </w:r>
+                <w:r>
+                  <w:rPr>
+                    <w:noProof/>
+                    <w:webHidden/>
+                  </w:rPr>
+                  <w:t>7</w:t>
+                </w:r>
+                <w:r>
+                  <w:rPr>
+                    <w:noProof/>
+                    <w:webHidden/>
+                  </w:rPr>
+                  <w:fldChar w:fldCharType="end"/>
+                </w:r>
+              </w:hyperlink>
+            </w:p>
+            <w:p>
+              <w:pPr>
+                <w:pStyle w:val="TOC2"/>
+                <w:tabs>
+                  <w:tab w:val="right" w:leader="dot" w:pos="9350"/>
+                </w:tabs>
+                <w:rPr>
+                  <w:rFonts w:eastAsiaTheme="minorEastAsia"/>
+                  <w:noProof/>
+                </w:rPr>
+              </w:pPr>
+              <w:hyperlink w:anchor="_Toc216749831" w:history="1">
+                <w:r>
+                  <w:rPr>
+                    <w:rStyle w:val="Hyperlink"/>
+                    <w:noProof/>
+                  </w:rPr>
+                  <w:t>What is BERT?</w:t>
+                </w:r>
+                <w:r>
+                  <w:rPr>
+                    <w:noProof/>
+                    <w:webHidden/>
+                  </w:rPr>
+                  <w:tab/>
+                </w:r>
+                <w:r>
+                  <w:rPr>
+                    <w:noProof/>
+                    <w:webHidden/>
+                  </w:rPr>
+                  <w:fldChar w:fldCharType="begin"/>
+                </w:r>
+                <w:r>
+                  <w:rPr>
+                    <w:noProof/>
+                    <w:webHidden/>
+                  </w:rPr>
+                  <w:instrText xml:space="preserve"> PAGEREF _Toc216749831 \h </w:instrText>
+                </w:r>
+                <w:r>
+                  <w:rPr>
+                    <w:noProof/>
+                    <w:webHidden/>
+                  </w:rPr>
+                </w:r>
+                <w:r>
+                  <w:rPr>
+                    <w:noProof/>
+                    <w:webHidden/>
+                  </w:rPr>
+                  <w:fldChar w:fldCharType="separate"/>
+                </w:r>
+                <w:r>
+                  <w:rPr>
+                    <w:noProof/>
+                    <w:webHidden/>
+                  </w:rPr>
+                  <w:t>7</w:t>
+                </w:r>
+                <w:r>
+                  <w:rPr>
+                    <w:noProof/>
+                    <w:webHidden/>
+                  </w:rPr>
+                  <w:fldChar w:fldCharType="end"/>
+                </w:r>
+              </w:hyperlink>
+            </w:p>
+            <w:p>
+              <w:pPr>
+                <w:pStyle w:val="TOC2"/>
+                <w:tabs>
+                  <w:tab w:val="right" w:leader="dot" w:pos="9350"/>
+                </w:tabs>
+                <w:rPr>
+                  <w:rFonts w:eastAsiaTheme="minorEastAsia"/>
+                  <w:noProof/>
+                </w:rPr>
+              </w:pPr>
+              <w:hyperlink w:anchor="_Toc216749832" w:history="1">
+                <w:r>
+                  <w:rPr>
+                    <w:rStyle w:val="Hyperlink"/>
+                    <w:noProof/>
+                  </w:rPr>
+                  <w:t>BERT-based models</w:t>
+                </w:r>
+                <w:r>
+                  <w:rPr>
+                    <w:noProof/>
+                    <w:webHidden/>
+                  </w:rPr>
+                  <w:tab/>
+                </w:r>
+                <w:r>
+                  <w:rPr>
+                    <w:noProof/>
+                    <w:webHidden/>
+                  </w:rPr>
+                  <w:fldChar w:fldCharType="begin"/>
+                </w:r>
+                <w:r>
+                  <w:rPr>
+                    <w:noProof/>
+                    <w:webHidden/>
+                  </w:rPr>
+                  <w:instrText xml:space="preserve"> PAGEREF _Toc216749832 \h </w:instrText>
+                </w:r>
+                <w:r>
+                  <w:rPr>
+                    <w:noProof/>
+                    <w:webHidden/>
+                  </w:rPr>
+                </w:r>
+                <w:r>
+                  <w:rPr>
+                    <w:noProof/>
+                    <w:webHidden/>
+                  </w:rPr>
+                  <w:fldChar w:fldCharType="separate"/>
+                </w:r>
+                <w:r>
+                  <w:rPr>
+                    <w:noProof/>
+                    <w:webHidden/>
+                  </w:rPr>
+                  <w:t>7</w:t>
+                </w:r>
+                <w:r>
+                  <w:rPr>
+                    <w:noProof/>
+                    <w:webHidden/>
+                  </w:rPr>
+                  <w:fldChar w:fldCharType="end"/>
+                </w:r>
+              </w:hyperlink>
+            </w:p>
+            <w:p>
+              <w:pPr>
+                <w:pStyle w:val="TOC2"/>
+                <w:tabs>
+                  <w:tab w:val="right" w:leader="dot" w:pos="9350"/>
+                </w:tabs>
+                <w:rPr>
+                  <w:rFonts w:eastAsiaTheme="minorEastAsia"/>
+                  <w:noProof/>
+                </w:rPr>
+              </w:pPr>
+              <w:hyperlink w:anchor="_Toc216749833" w:history="1">
+                <w:r>
+                  <w:rPr>
+                    <w:rStyle w:val="Hyperlink"/>
+                    <w:noProof/>
+                  </w:rPr>
+                  <w:t>How does BERT process the input?</w:t>
+                </w:r>
+                <w:r>
+                  <w:rPr>
+                    <w:noProof/>
+                    <w:webHidden/>
+                  </w:rPr>
+                  <w:tab/>
+                </w:r>
+                <w:r>
+                  <w:rPr>
+                    <w:noProof/>
+                    <w:webHidden/>
+                  </w:rPr>
+                  <w:fldChar w:fldCharType="begin"/>
+                </w:r>
+                <w:r>
+                  <w:rPr>
+                    <w:noProof/>
+                    <w:webHidden/>
+                  </w:rPr>
+                  <w:instrText xml:space="preserve"> PAGEREF _Toc216749833 \h </w:instrText>
+                </w:r>
+                <w:r>
+                  <w:rPr>
+                    <w:noProof/>
+                    <w:webHidden/>
+                  </w:rPr>
+                </w:r>
+                <w:r>
+                  <w:rPr>
+                    <w:noProof/>
+                    <w:webHidden/>
+                  </w:rPr>
+                  <w:fldChar w:fldCharType="separate"/>
+                </w:r>
+                <w:r>
+                  <w:rPr>
+                    <w:noProof/>
+                    <w:webHidden/>
+                  </w:rPr>
+                  <w:t>8</w:t>
                 </w:r>
                 <w:r>
                   <w:rPr>
@@ -1693,7 +2049,7 @@
                   <w:noProof/>
                 </w:rPr>
               </w:pPr>
-              <w:hyperlink w:anchor="_Toc215832381" w:history="1">
+              <w:hyperlink w:anchor="_Toc216749834" w:history="1">
                 <w:r>
                   <w:rPr>
                     <w:rStyle w:val="Hyperlink"/>
@@ -1720,7 +2076,7 @@
                     <w:noProof/>
                     <w:webHidden/>
                   </w:rPr>
-                  <w:instrText xml:space="preserve"> PAGEREF _Toc215832381 \h </w:instrText>
+                  <w:instrText xml:space="preserve"> PAGEREF _Toc216749834 \h </w:instrText>
                 </w:r>
                 <w:r>
                   <w:rPr>
@@ -1740,7 +2096,7 @@
                     <w:noProof/>
                     <w:webHidden/>
                   </w:rPr>
-                  <w:t>4</w:t>
+                  <w:t>8</w:t>
                 </w:r>
                 <w:r>
                   <w:rPr>
@@ -1762,7 +2118,7 @@
                   <w:noProof/>
                 </w:rPr>
               </w:pPr>
-              <w:hyperlink w:anchor="_Toc215832382" w:history="1">
+              <w:hyperlink w:anchor="_Toc216749835" w:history="1">
                 <w:r>
                   <w:rPr>
                     <w:rStyle w:val="Hyperlink"/>
@@ -1789,7 +2145,7 @@
                     <w:noProof/>
                     <w:webHidden/>
                   </w:rPr>
-                  <w:instrText xml:space="preserve"> PAGEREF _Toc215832382 \h </w:instrText>
+                  <w:instrText xml:space="preserve"> PAGEREF _Toc216749835 \h </w:instrText>
                 </w:r>
                 <w:r>
                   <w:rPr>
@@ -1809,7 +2165,7 @@
                     <w:noProof/>
                     <w:webHidden/>
                   </w:rPr>
-                  <w:t>5</w:t>
+                  <w:t>8</w:t>
                 </w:r>
                 <w:r>
                   <w:rPr>
@@ -1831,7 +2187,7 @@
                   <w:noProof/>
                 </w:rPr>
               </w:pPr>
-              <w:hyperlink w:anchor="_Toc215832383" w:history="1">
+              <w:hyperlink w:anchor="_Toc216749836" w:history="1">
                 <w:r>
                   <w:rPr>
                     <w:rStyle w:val="Hyperlink"/>
@@ -1858,7 +2214,7 @@
                     <w:noProof/>
                     <w:webHidden/>
                   </w:rPr>
-                  <w:instrText xml:space="preserve"> PAGEREF _Toc215832383 \h </w:instrText>
+                  <w:instrText xml:space="preserve"> PAGEREF _Toc216749836 \h </w:instrText>
                 </w:r>
                 <w:r>
                   <w:rPr>
@@ -1878,7 +2234,7 @@
                     <w:noProof/>
                     <w:webHidden/>
                   </w:rPr>
-                  <w:t>5</w:t>
+                  <w:t>9</w:t>
                 </w:r>
                 <w:r>
                   <w:rPr>
@@ -1900,7 +2256,7 @@
                   <w:noProof/>
                 </w:rPr>
               </w:pPr>
-              <w:hyperlink w:anchor="_Toc215832384" w:history="1">
+              <w:hyperlink w:anchor="_Toc216749837" w:history="1">
                 <w:r>
                   <w:rPr>
                     <w:rStyle w:val="Hyperlink"/>
@@ -1927,7 +2283,7 @@
                     <w:noProof/>
                     <w:webHidden/>
                   </w:rPr>
-                  <w:instrText xml:space="preserve"> PAGEREF _Toc215832384 \h </w:instrText>
+                  <w:instrText xml:space="preserve"> PAGEREF _Toc216749837 \h </w:instrText>
                 </w:r>
                 <w:r>
                   <w:rPr>
@@ -1947,7 +2303,7 @@
                     <w:noProof/>
                     <w:webHidden/>
                   </w:rPr>
-                  <w:t>6</w:t>
+                  <w:t>9</w:t>
                 </w:r>
                 <w:r>
                   <w:rPr>
@@ -1969,7 +2325,7 @@
                   <w:noProof/>
                 </w:rPr>
               </w:pPr>
-              <w:hyperlink w:anchor="_Toc215832385" w:history="1">
+              <w:hyperlink w:anchor="_Toc216749838" w:history="1">
                 <w:r>
                   <w:rPr>
                     <w:rStyle w:val="Hyperlink"/>
@@ -1996,7 +2352,7 @@
                     <w:noProof/>
                     <w:webHidden/>
                   </w:rPr>
-                  <w:instrText xml:space="preserve"> PAGEREF _Toc215832385 \h </w:instrText>
+                  <w:instrText xml:space="preserve"> PAGEREF _Toc216749838 \h </w:instrText>
                 </w:r>
                 <w:r>
                   <w:rPr>
@@ -2016,7 +2372,7 @@
                     <w:noProof/>
                     <w:webHidden/>
                   </w:rPr>
-                  <w:t>7</w:t>
+                  <w:t>10</w:t>
                 </w:r>
                 <w:r>
                   <w:rPr>
@@ -2038,7 +2394,7 @@
                   <w:noProof/>
                 </w:rPr>
               </w:pPr>
-              <w:hyperlink w:anchor="_Toc215832386" w:history="1">
+              <w:hyperlink w:anchor="_Toc216749839" w:history="1">
                 <w:r>
                   <w:rPr>
                     <w:rStyle w:val="Hyperlink"/>
@@ -2065,7 +2421,7 @@
                     <w:noProof/>
                     <w:webHidden/>
                   </w:rPr>
-                  <w:instrText xml:space="preserve"> PAGEREF _Toc215832386 \h </w:instrText>
+                  <w:instrText xml:space="preserve"> PAGEREF _Toc216749839 \h </w:instrText>
                 </w:r>
                 <w:r>
                   <w:rPr>
@@ -2085,7 +2441,7 @@
                     <w:noProof/>
                     <w:webHidden/>
                   </w:rPr>
-                  <w:t>8</w:t>
+                  <w:t>11</w:t>
                 </w:r>
                 <w:r>
                   <w:rPr>
@@ -2107,7 +2463,7 @@
                   <w:noProof/>
                 </w:rPr>
               </w:pPr>
-              <w:hyperlink w:anchor="_Toc215832387" w:history="1">
+              <w:hyperlink w:anchor="_Toc216749840" w:history="1">
                 <w:r>
                   <w:rPr>
                     <w:rStyle w:val="Hyperlink"/>
@@ -2134,7 +2490,7 @@
                     <w:noProof/>
                     <w:webHidden/>
                   </w:rPr>
-                  <w:instrText xml:space="preserve"> PAGEREF _Toc215832387 \h </w:instrText>
+                  <w:instrText xml:space="preserve"> PAGEREF _Toc216749840 \h </w:instrText>
                 </w:r>
                 <w:r>
                   <w:rPr>
@@ -2154,7 +2510,7 @@
                     <w:noProof/>
                     <w:webHidden/>
                   </w:rPr>
-                  <w:t>8</w:t>
+                  <w:t>11</w:t>
                 </w:r>
                 <w:r>
                   <w:rPr>
@@ -2176,7 +2532,7 @@
                   <w:noProof/>
                 </w:rPr>
               </w:pPr>
-              <w:hyperlink w:anchor="_Toc215832388" w:history="1">
+              <w:hyperlink w:anchor="_Toc216749841" w:history="1">
                 <w:r>
                   <w:rPr>
                     <w:rStyle w:val="Hyperlink"/>
@@ -2203,7 +2559,7 @@
                     <w:noProof/>
                     <w:webHidden/>
                   </w:rPr>
-                  <w:instrText xml:space="preserve"> PAGEREF _Toc215832388 \h </w:instrText>
+                  <w:instrText xml:space="preserve"> PAGEREF _Toc216749841 \h </w:instrText>
                 </w:r>
                 <w:r>
                   <w:rPr>
@@ -2223,7 +2579,7 @@
                     <w:noProof/>
                     <w:webHidden/>
                   </w:rPr>
-                  <w:t>8</w:t>
+                  <w:t>12</w:t>
                 </w:r>
                 <w:r>
                   <w:rPr>
@@ -2245,7 +2601,7 @@
                   <w:noProof/>
                 </w:rPr>
               </w:pPr>
-              <w:hyperlink w:anchor="_Toc215832389" w:history="1">
+              <w:hyperlink w:anchor="_Toc216749842" w:history="1">
                 <w:r>
                   <w:rPr>
                     <w:rStyle w:val="Hyperlink"/>
@@ -2272,7 +2628,7 @@
                     <w:noProof/>
                     <w:webHidden/>
                   </w:rPr>
-                  <w:instrText xml:space="preserve"> PAGEREF _Toc215832389 \h </w:instrText>
+                  <w:instrText xml:space="preserve"> PAGEREF _Toc216749842 \h </w:instrText>
                 </w:r>
                 <w:r>
                   <w:rPr>
@@ -2292,7 +2648,7 @@
                     <w:noProof/>
                     <w:webHidden/>
                   </w:rPr>
-                  <w:t>8</w:t>
+                  <w:t>12</w:t>
                 </w:r>
                 <w:r>
                   <w:rPr>
@@ -2314,7 +2670,7 @@
                   <w:noProof/>
                 </w:rPr>
               </w:pPr>
-              <w:hyperlink w:anchor="_Toc215832390" w:history="1">
+              <w:hyperlink w:anchor="_Toc216749843" w:history="1">
                 <w:r>
                   <w:rPr>
                     <w:rStyle w:val="Hyperlink"/>
@@ -2341,7 +2697,7 @@
                     <w:noProof/>
                     <w:webHidden/>
                   </w:rPr>
-                  <w:instrText xml:space="preserve"> PAGEREF _Toc215832390 \h </w:instrText>
+                  <w:instrText xml:space="preserve"> PAGEREF _Toc216749843 \h </w:instrText>
                 </w:r>
                 <w:r>
                   <w:rPr>
@@ -2361,7 +2717,7 @@
                     <w:noProof/>
                     <w:webHidden/>
                   </w:rPr>
-                  <w:t>10</w:t>
+                  <w:t>14</w:t>
                 </w:r>
                 <w:r>
                   <w:rPr>
@@ -2383,7 +2739,7 @@
                   <w:noProof/>
                 </w:rPr>
               </w:pPr>
-              <w:hyperlink w:anchor="_Toc215832391" w:history="1">
+              <w:hyperlink w:anchor="_Toc216749844" w:history="1">
                 <w:r>
                   <w:rPr>
                     <w:rStyle w:val="Hyperlink"/>
@@ -2410,7 +2766,7 @@
                     <w:noProof/>
                     <w:webHidden/>
                   </w:rPr>
-                  <w:instrText xml:space="preserve"> PAGEREF _Toc215832391 \h </w:instrText>
+                  <w:instrText xml:space="preserve"> PAGEREF _Toc216749844 \h </w:instrText>
                 </w:r>
                 <w:r>
                   <w:rPr>
@@ -2430,7 +2786,7 @@
                     <w:noProof/>
                     <w:webHidden/>
                   </w:rPr>
-                  <w:t>11</w:t>
+                  <w:t>15</w:t>
                 </w:r>
                 <w:r>
                   <w:rPr>
@@ -2453,9 +2809,6 @@
             </w:p>
           </w:sdtContent>
         </w:sdt>
-        <w:p/>
-        <w:p/>
-        <w:p/>
       </w:sdtContent>
     </w:sdt>
     <w:p>
@@ -2466,7 +2819,7 @@
           <w:szCs w:val="40"/>
         </w:rPr>
       </w:pPr>
-      <w:bookmarkStart w:id="0" w:name="_Toc215832366"/>
+      <w:bookmarkStart w:id="0" w:name="_Toc216749814"/>
       <w:r>
         <w:rPr>
           <w:sz w:val="40"/>
@@ -2500,7 +2853,7 @@
           <w:szCs w:val="40"/>
         </w:rPr>
       </w:pPr>
-      <w:bookmarkStart w:id="1" w:name="_Toc215832367"/>
+      <w:bookmarkStart w:id="1" w:name="_Toc216749815"/>
       <w:r>
         <w:rPr>
           <w:sz w:val="40"/>
@@ -2518,7 +2871,7 @@
           <w:szCs w:val="36"/>
         </w:rPr>
       </w:pPr>
-      <w:bookmarkStart w:id="2" w:name="_Toc215832368"/>
+      <w:bookmarkStart w:id="2" w:name="_Toc216749816"/>
       <w:r>
         <w:rPr>
           <w:sz w:val="36"/>
@@ -2593,7 +2946,7 @@
           <w:szCs w:val="36"/>
         </w:rPr>
       </w:pPr>
-      <w:bookmarkStart w:id="3" w:name="_Toc215832369"/>
+      <w:bookmarkStart w:id="3" w:name="_Toc216749817"/>
       <w:r>
         <w:rPr>
           <w:sz w:val="36"/>
@@ -2729,7 +3082,7 @@
           <w:szCs w:val="40"/>
         </w:rPr>
       </w:pPr>
-      <w:bookmarkStart w:id="4" w:name="_Toc215832370"/>
+      <w:bookmarkStart w:id="4" w:name="_Toc216749818"/>
       <w:r>
         <w:rPr>
           <w:sz w:val="40"/>
@@ -2748,7 +3101,7 @@
           <w:szCs w:val="36"/>
         </w:rPr>
       </w:pPr>
-      <w:bookmarkStart w:id="5" w:name="_Toc215832371"/>
+      <w:bookmarkStart w:id="5" w:name="_Toc216749819"/>
       <w:r>
         <w:rPr>
           <w:sz w:val="36"/>
@@ -2788,7 +3141,7 @@
           <w:szCs w:val="36"/>
         </w:rPr>
       </w:pPr>
-      <w:bookmarkStart w:id="6" w:name="_Toc215832372"/>
+      <w:bookmarkStart w:id="6" w:name="_Toc216749820"/>
       <w:r>
         <w:rPr>
           <w:sz w:val="36"/>
@@ -2835,7 +3188,7 @@
           <w:szCs w:val="36"/>
         </w:rPr>
       </w:pPr>
-      <w:bookmarkStart w:id="7" w:name="_Toc215832373"/>
+      <w:bookmarkStart w:id="7" w:name="_Toc216749821"/>
       <w:r>
         <w:rPr>
           <w:sz w:val="36"/>
@@ -2868,7 +3221,7 @@
           <w:szCs w:val="36"/>
         </w:rPr>
       </w:pPr>
-      <w:bookmarkStart w:id="8" w:name="_Toc215832374"/>
+      <w:bookmarkStart w:id="8" w:name="_Toc216749822"/>
       <w:r>
         <w:rPr>
           <w:sz w:val="36"/>
@@ -2901,7 +3254,7 @@
           <w:szCs w:val="36"/>
         </w:rPr>
       </w:pPr>
-      <w:bookmarkStart w:id="9" w:name="_Toc215832375"/>
+      <w:bookmarkStart w:id="9" w:name="_Toc216749823"/>
       <w:r>
         <w:rPr>
           <w:sz w:val="36"/>
@@ -2934,7 +3287,7 @@
           <w:szCs w:val="36"/>
         </w:rPr>
       </w:pPr>
-      <w:bookmarkStart w:id="10" w:name="_Toc215832376"/>
+      <w:bookmarkStart w:id="10" w:name="_Toc216749824"/>
       <w:r>
         <w:rPr>
           <w:sz w:val="36"/>
@@ -2988,14 +3341,28 @@
           <w:szCs w:val="40"/>
         </w:rPr>
       </w:pPr>
-      <w:bookmarkStart w:id="11" w:name="_Toc215832377"/>
+      <w:bookmarkStart w:id="11" w:name="_Toc216749825"/>
       <w:r>
         <w:rPr>
           <w:sz w:val="40"/>
           <w:szCs w:val="40"/>
         </w:rPr>
         <w:lastRenderedPageBreak/>
-        <w:t>BERT</w:t>
+        <w:t xml:space="preserve">Natural Language </w:t>
+      </w:r>
+      <w:r>
+        <w:rPr>
+          <w:sz w:val="40"/>
+          <w:szCs w:val="40"/>
+        </w:rPr>
+        <w:t>P</w:t>
+      </w:r>
+      <w:r>
+        <w:rPr>
+          <w:sz w:val="40"/>
+          <w:szCs w:val="40"/>
+        </w:rPr>
+        <w:t>rocessing</w:t>
       </w:r>
       <w:bookmarkEnd w:id="11"/>
     </w:p>
@@ -3007,13 +3374,13 @@
           <w:szCs w:val="36"/>
         </w:rPr>
       </w:pPr>
-      <w:bookmarkStart w:id="12" w:name="_Toc215832378"/>
+      <w:bookmarkStart w:id="12" w:name="_Toc216749826"/>
       <w:r>
         <w:rPr>
           <w:sz w:val="36"/>
           <w:szCs w:val="36"/>
         </w:rPr>
-        <w:t>What is BERT?</w:t>
+        <w:t>What is NLP?</w:t>
       </w:r>
       <w:bookmarkEnd w:id="12"/>
     </w:p>
@@ -3029,67 +3396,151 @@
           <w:sz w:val="28"/>
           <w:szCs w:val="28"/>
         </w:rPr>
-        <w:t xml:space="preserve">BERT is a transformer-based model that uses a stack of encoders to learn the relationships between the words in a sentence. Instead of reading the text from left to right, it goes through the whole text and forms a contextual understanding. </w:t>
-      </w:r>
-    </w:p>
-    <w:p>
-      <w:pPr>
-        <w:pStyle w:val="Heading2"/>
-        <w:rPr>
-          <w:sz w:val="36"/>
-          <w:szCs w:val="36"/>
-        </w:rPr>
-      </w:pPr>
-      <w:bookmarkStart w:id="13" w:name="_Toc215832379"/>
-      <w:r>
-        <w:rPr>
-          <w:sz w:val="36"/>
-          <w:szCs w:val="36"/>
-        </w:rPr>
-        <w:t>BERT-based models</w:t>
-      </w:r>
-      <w:bookmarkEnd w:id="13"/>
+        <w:t xml:space="preserve">Natural language processing is a field of AI that uses machine learning techniques to enable computers to understand and communicate with human language. </w:t>
+      </w:r>
+      <w:r>
+        <w:rPr>
+          <w:sz w:val="28"/>
+          <w:szCs w:val="28"/>
+        </w:rPr>
+        <w:t xml:space="preserve">Its importance comes from the fact that it bridges </w:t>
+      </w:r>
+      <w:r>
+        <w:rPr>
+          <w:sz w:val="28"/>
+          <w:szCs w:val="28"/>
+        </w:rPr>
+        <w:t xml:space="preserve">human communication and machine understanding – it allows systems to extract meaning from unstructured language data and perform complex tasks. </w:t>
+      </w:r>
+    </w:p>
+    <w:p>
+      <w:pPr>
+        <w:rPr>
+          <w:sz w:val="28"/>
+          <w:szCs w:val="28"/>
+        </w:rPr>
+      </w:pPr>
+      <w:r>
+        <w:rPr>
+          <w:sz w:val="28"/>
+          <w:szCs w:val="28"/>
+        </w:rPr>
+        <w:t>NLP’s origins trace back to 1950, when Alan Turing created the Turing test to answer the question of whether machines can think</w:t>
+      </w:r>
+      <w:r>
+        <w:rPr>
+          <w:sz w:val="28"/>
+          <w:szCs w:val="28"/>
+        </w:rPr>
+        <w:t xml:space="preserve"> and assess how well they can understand and process text. The Turing test involves an evaluator, a human and a computer. The evaluator has to communicate with both the computer and the other person, and tell which one is which. If he cannot reliably distinguish the two, the test is passed.  </w:t>
+      </w:r>
+    </w:p>
+    <w:p>
+      <w:pPr>
+        <w:rPr>
+          <w:sz w:val="28"/>
+          <w:szCs w:val="28"/>
+        </w:rPr>
+      </w:pPr>
+      <w:r>
+        <w:rPr>
+          <w:sz w:val="28"/>
+          <w:szCs w:val="28"/>
+        </w:rPr>
+        <w:t>Nowadays, NLP contributes to automation and provides a personalized experience through chatbots, virtual assistants and recommendation systems. It is used to improve accessibility by creating speech recognition systems and translation tools, which</w:t>
+      </w:r>
+      <w:r>
+        <w:rPr>
+          <w:sz w:val="28"/>
+          <w:szCs w:val="28"/>
+        </w:rPr>
+        <w:t xml:space="preserve"> </w:t>
+      </w:r>
+      <w:r>
+        <w:rPr>
+          <w:sz w:val="28"/>
+          <w:szCs w:val="28"/>
+        </w:rPr>
+        <w:t>make</w:t>
+      </w:r>
+      <w:r>
+        <w:rPr>
+          <w:sz w:val="28"/>
+          <w:szCs w:val="28"/>
+        </w:rPr>
+        <w:t xml:space="preserve"> information easily accessible for more people regardless </w:t>
+      </w:r>
+      <w:r>
+        <w:rPr>
+          <w:sz w:val="28"/>
+          <w:szCs w:val="28"/>
+        </w:rPr>
+        <w:t xml:space="preserve">of </w:t>
+      </w:r>
+      <w:r>
+        <w:rPr>
+          <w:sz w:val="28"/>
+          <w:szCs w:val="28"/>
+        </w:rPr>
+        <w:t xml:space="preserve">disabilities or language barriers. </w:t>
+      </w:r>
+    </w:p>
+    <w:p>
+      <w:pPr>
+        <w:rPr>
+          <w:sz w:val="28"/>
+          <w:szCs w:val="28"/>
+        </w:rPr>
+      </w:pPr>
+      <w:r>
+        <w:rPr>
+          <w:sz w:val="28"/>
+          <w:szCs w:val="28"/>
+        </w:rPr>
+        <w:t>Benefits:</w:t>
+      </w:r>
     </w:p>
     <w:p>
       <w:pPr>
         <w:pStyle w:val="ListParagraph"/>
         <w:numPr>
           <w:ilvl w:val="0"/>
-          <w:numId w:val="11"/>
+          <w:numId w:val="18"/>
         </w:numPr>
+        <w:rPr>
+          <w:sz w:val="28"/>
+          <w:szCs w:val="28"/>
+        </w:rPr>
+      </w:pPr>
+      <w:r>
         <w:rPr>
           <w:b/>
           <w:bCs/>
           <w:sz w:val="28"/>
           <w:szCs w:val="28"/>
         </w:rPr>
-      </w:pPr>
-      <w:proofErr w:type="spellStart"/>
-      <w:r>
-        <w:rPr>
-          <w:b/>
-          <w:bCs/>
-          <w:sz w:val="28"/>
-          <w:szCs w:val="28"/>
-        </w:rPr>
-        <w:t>DistilBERT</w:t>
-      </w:r>
-      <w:proofErr w:type="spellEnd"/>
-      <w:r>
-        <w:rPr>
-          <w:b/>
-          <w:bCs/>
-          <w:sz w:val="28"/>
-          <w:szCs w:val="28"/>
-        </w:rPr>
-        <w:t xml:space="preserve"> – </w:t>
-      </w:r>
-      <w:r>
-        <w:rPr>
-          <w:sz w:val="28"/>
-          <w:szCs w:val="28"/>
-        </w:rPr>
-        <w:t>trained through knowledge distillation (machine learning technique that transfers knowledge from a complex “teacher” model to a smaller “student” model); smaller and faster</w:t>
+        <w:t xml:space="preserve">Automation – </w:t>
+      </w:r>
+      <w:r>
+        <w:rPr>
+          <w:sz w:val="28"/>
+          <w:szCs w:val="28"/>
+        </w:rPr>
+        <w:t>NLP helps automate tasks such as customer service</w:t>
+      </w:r>
+      <w:r>
+        <w:rPr>
+          <w:sz w:val="28"/>
+          <w:szCs w:val="28"/>
+        </w:rPr>
+        <w:t>, content generation and data analysis, reducing the need of manual intervention</w:t>
+      </w:r>
+      <w:r>
+        <w:rPr>
+          <w:sz w:val="28"/>
+          <w:szCs w:val="28"/>
+        </w:rPr>
+        <w:t xml:space="preserve"> </w:t>
       </w:r>
     </w:p>
     <w:p>
@@ -3097,39 +3548,28 @@
         <w:pStyle w:val="ListParagraph"/>
         <w:numPr>
           <w:ilvl w:val="0"/>
-          <w:numId w:val="11"/>
+          <w:numId w:val="18"/>
         </w:numPr>
+        <w:rPr>
+          <w:sz w:val="28"/>
+          <w:szCs w:val="28"/>
+        </w:rPr>
+      </w:pPr>
+      <w:r>
         <w:rPr>
           <w:b/>
           <w:bCs/>
           <w:sz w:val="28"/>
           <w:szCs w:val="28"/>
         </w:rPr>
-      </w:pPr>
-      <w:r>
-        <w:rPr>
-          <w:b/>
-          <w:bCs/>
-          <w:sz w:val="28"/>
-          <w:szCs w:val="28"/>
-        </w:rPr>
-        <w:t>ALBERT</w:t>
-      </w:r>
-      <w:r>
-        <w:rPr>
-          <w:b/>
-          <w:bCs/>
-          <w:sz w:val="28"/>
-          <w:szCs w:val="28"/>
-        </w:rPr>
-        <w:t xml:space="preserve"> – </w:t>
-      </w:r>
-      <w:r>
-        <w:rPr>
-          <w:sz w:val="28"/>
-          <w:szCs w:val="28"/>
-        </w:rPr>
-        <w:t>uses 2 parameter-reduction techniques to address problems related to memory limitations, longer training time and unexpected model degradation in BERT</w:t>
+        <w:t xml:space="preserve">Accessibility – </w:t>
+      </w:r>
+      <w:r>
+        <w:rPr>
+          <w:sz w:val="28"/>
+          <w:szCs w:val="28"/>
+        </w:rPr>
+        <w:t xml:space="preserve">voice assistants and speech recognition systems make interactions more inclusive </w:t>
       </w:r>
     </w:p>
     <w:p>
@@ -3137,16 +3577,42 @@
         <w:pStyle w:val="ListParagraph"/>
         <w:numPr>
           <w:ilvl w:val="0"/>
-          <w:numId w:val="11"/>
+          <w:numId w:val="18"/>
         </w:numPr>
+        <w:rPr>
+          <w:sz w:val="28"/>
+          <w:szCs w:val="28"/>
+        </w:rPr>
+      </w:pPr>
+      <w:r>
         <w:rPr>
           <w:b/>
           <w:bCs/>
           <w:sz w:val="28"/>
           <w:szCs w:val="28"/>
         </w:rPr>
-      </w:pPr>
-      <w:proofErr w:type="spellStart"/>
+        <w:t xml:space="preserve">Personalization – </w:t>
+      </w:r>
+      <w:r>
+        <w:rPr>
+          <w:sz w:val="28"/>
+          <w:szCs w:val="28"/>
+        </w:rPr>
+        <w:t xml:space="preserve">analyses user behavior and preferences to improve user experience  </w:t>
+      </w:r>
+    </w:p>
+    <w:p>
+      <w:pPr>
+        <w:pStyle w:val="ListParagraph"/>
+        <w:numPr>
+          <w:ilvl w:val="0"/>
+          <w:numId w:val="18"/>
+        </w:numPr>
+        <w:rPr>
+          <w:sz w:val="28"/>
+          <w:szCs w:val="28"/>
+        </w:rPr>
+      </w:pPr>
       <w:r>
         <w:rPr>
           <w:b/>
@@ -3154,9 +3620,8 @@
           <w:sz w:val="28"/>
           <w:szCs w:val="28"/>
         </w:rPr>
-        <w:t>ROBERTa</w:t>
-      </w:r>
-      <w:proofErr w:type="spellEnd"/>
+        <w:t xml:space="preserve">Multilingual support </w:t>
+      </w:r>
       <w:r>
         <w:rPr>
           <w:b/>
@@ -3164,29 +3629,23 @@
           <w:sz w:val="28"/>
           <w:szCs w:val="28"/>
         </w:rPr>
-        <w:t xml:space="preserve"> – </w:t>
-      </w:r>
-      <w:r>
-        <w:rPr>
-          <w:sz w:val="28"/>
-          <w:szCs w:val="28"/>
-        </w:rPr>
-        <w:t>uses dynamic masking and longer training to improve the performance</w:t>
-      </w:r>
-    </w:p>
-    <w:p>
-      <w:pPr>
-        <w:rPr>
-          <w:sz w:val="28"/>
-          <w:szCs w:val="28"/>
-        </w:rPr>
-      </w:pPr>
-      <w:r>
-        <w:rPr>
-          <w:sz w:val="28"/>
-          <w:szCs w:val="28"/>
-        </w:rPr>
-        <w:t>All models retain the transformer structure but are focused on improving the model’s efficiency.</w:t>
+        <w:t>–</w:t>
+      </w:r>
+      <w:r>
+        <w:rPr>
+          <w:b/>
+          <w:bCs/>
+          <w:sz w:val="28"/>
+          <w:szCs w:val="28"/>
+        </w:rPr>
+        <w:t xml:space="preserve"> </w:t>
+      </w:r>
+      <w:r>
+        <w:rPr>
+          <w:sz w:val="28"/>
+          <w:szCs w:val="28"/>
+        </w:rPr>
+        <w:t>makes more content accessible to global audience</w:t>
       </w:r>
     </w:p>
     <w:p>
@@ -3197,126 +3656,128 @@
           <w:szCs w:val="36"/>
         </w:rPr>
       </w:pPr>
-      <w:bookmarkStart w:id="14" w:name="_Toc215832380"/>
+      <w:bookmarkStart w:id="13" w:name="_Toc216749827"/>
       <w:r>
         <w:rPr>
           <w:sz w:val="36"/>
           <w:szCs w:val="36"/>
         </w:rPr>
-        <w:t xml:space="preserve">How </w:t>
-      </w:r>
-      <w:r>
-        <w:rPr>
-          <w:sz w:val="36"/>
-          <w:szCs w:val="36"/>
-        </w:rPr>
-        <w:t xml:space="preserve">does </w:t>
-      </w:r>
-      <w:r>
-        <w:rPr>
-          <w:sz w:val="36"/>
-          <w:szCs w:val="36"/>
-        </w:rPr>
-        <w:t xml:space="preserve">BERT </w:t>
-      </w:r>
-      <w:r>
-        <w:rPr>
-          <w:sz w:val="36"/>
-          <w:szCs w:val="36"/>
-        </w:rPr>
-        <w:t>process</w:t>
-      </w:r>
-      <w:r>
-        <w:rPr>
-          <w:sz w:val="36"/>
-          <w:szCs w:val="36"/>
-        </w:rPr>
-        <w:t xml:space="preserve"> the input?</w:t>
-      </w:r>
-      <w:bookmarkEnd w:id="14"/>
-    </w:p>
-    <w:p>
-      <w:pPr>
-        <w:rPr>
-          <w:sz w:val="28"/>
-          <w:szCs w:val="28"/>
-        </w:rPr>
-      </w:pPr>
-      <w:r>
-        <w:rPr>
-          <w:sz w:val="28"/>
-          <w:szCs w:val="28"/>
-        </w:rPr>
-        <w:t>The model cannot work with raw text. It relies on a structured and tokenized input to be able to understand and analyze the given text.</w:t>
-      </w:r>
-    </w:p>
-    <w:p>
-      <w:pPr>
-        <w:pStyle w:val="Heading3"/>
-        <w:rPr>
-          <w:sz w:val="32"/>
-          <w:szCs w:val="32"/>
-        </w:rPr>
-      </w:pPr>
-      <w:bookmarkStart w:id="15" w:name="_Toc215832381"/>
-      <w:r>
-        <w:rPr>
-          <w:sz w:val="32"/>
-          <w:szCs w:val="32"/>
+        <w:t>Key concepts of NLP</w:t>
+      </w:r>
+      <w:bookmarkEnd w:id="13"/>
+    </w:p>
+    <w:p/>
+    <w:p>
+      <w:pPr>
+        <w:pStyle w:val="ListParagraph"/>
+        <w:numPr>
+          <w:ilvl w:val="0"/>
+          <w:numId w:val="17"/>
+        </w:numPr>
+        <w:rPr>
+          <w:sz w:val="28"/>
+          <w:szCs w:val="28"/>
+        </w:rPr>
+      </w:pPr>
+      <w:r>
+        <w:rPr>
+          <w:b/>
+          <w:bCs/>
+          <w:sz w:val="28"/>
+          <w:szCs w:val="28"/>
         </w:rPr>
         <w:t>Tokenization</w:t>
       </w:r>
-      <w:bookmarkEnd w:id="15"/>
-    </w:p>
-    <w:p>
-      <w:pPr>
-        <w:rPr>
-          <w:sz w:val="28"/>
-          <w:szCs w:val="28"/>
-        </w:rPr>
-      </w:pPr>
-      <w:r>
-        <w:rPr>
-          <w:sz w:val="28"/>
-          <w:szCs w:val="28"/>
-        </w:rPr>
-        <w:t>The first step in this process is called “</w:t>
-      </w:r>
-      <w:proofErr w:type="spellStart"/>
-      <w:r>
-        <w:rPr>
-          <w:sz w:val="28"/>
-          <w:szCs w:val="28"/>
-        </w:rPr>
-        <w:t>WordPiece</w:t>
-      </w:r>
-      <w:proofErr w:type="spellEnd"/>
-      <w:r>
-        <w:rPr>
-          <w:sz w:val="28"/>
-          <w:szCs w:val="28"/>
-        </w:rPr>
-        <w:t xml:space="preserve">” tokenization – breaks the text into sub-word units to limit the vocabulary size and handle rare or unseen words. </w:t>
-      </w:r>
+      <w:r>
+        <w:rPr>
+          <w:sz w:val="28"/>
+          <w:szCs w:val="28"/>
+        </w:rPr>
+        <w:t xml:space="preserve"> – converts unstructured text data into manageable pieces (words, phrases or sentences) that can be analyzed</w:t>
+      </w:r>
+    </w:p>
+    <w:p>
+      <w:pPr>
+        <w:pStyle w:val="ListParagraph"/>
+        <w:numPr>
+          <w:ilvl w:val="0"/>
+          <w:numId w:val="17"/>
+        </w:numPr>
+        <w:rPr>
+          <w:sz w:val="28"/>
+          <w:szCs w:val="28"/>
+        </w:rPr>
+      </w:pPr>
+      <w:r>
+        <w:rPr>
+          <w:b/>
+          <w:bCs/>
+          <w:sz w:val="28"/>
+          <w:szCs w:val="28"/>
+        </w:rPr>
+        <w:lastRenderedPageBreak/>
+        <w:t>Stop Word Removal</w:t>
+      </w:r>
+      <w:r>
+        <w:rPr>
+          <w:sz w:val="28"/>
+          <w:szCs w:val="28"/>
+        </w:rPr>
+        <w:t xml:space="preserve"> – stop words are frequently used words that usually do not carry weight in text analysis – “the”, “and”, “is”. By removing those words, the </w:t>
+      </w:r>
+      <w:r>
+        <w:rPr>
+          <w:sz w:val="28"/>
+          <w:szCs w:val="28"/>
+        </w:rPr>
+        <w:t>model</w:t>
+      </w:r>
+      <w:r>
+        <w:rPr>
+          <w:sz w:val="28"/>
+          <w:szCs w:val="28"/>
+        </w:rPr>
+        <w:t xml:space="preserve"> focuses on the more important ones</w:t>
+      </w:r>
+      <w:r>
+        <w:rPr>
+          <w:sz w:val="28"/>
+          <w:szCs w:val="28"/>
+        </w:rPr>
+        <w:t>, which improves its performance.</w:t>
+      </w:r>
+    </w:p>
+    <w:p>
+      <w:pPr>
+        <w:pStyle w:val="ListParagraph"/>
+        <w:numPr>
+          <w:ilvl w:val="0"/>
+          <w:numId w:val="17"/>
+        </w:numPr>
+        <w:rPr>
+          <w:b/>
+          <w:bCs/>
+          <w:sz w:val="28"/>
+          <w:szCs w:val="28"/>
+        </w:rPr>
+      </w:pPr>
       <w:r>
         <w:rPr>
           <w:noProof/>
-          <w:sz w:val="28"/>
-          <w:szCs w:val="28"/>
         </w:rPr>
         <w:drawing>
-          <wp:anchor distT="0" distB="0" distL="114300" distR="114300" simplePos="0" relativeHeight="251667456" behindDoc="0" locked="0" layoutInCell="1" allowOverlap="1" wp14:anchorId="21EB3A98" wp14:editId="7AEE33A0">
+          <wp:anchor distT="0" distB="0" distL="114300" distR="114300" simplePos="0" relativeHeight="251669504" behindDoc="0" locked="0" layoutInCell="1" allowOverlap="1" wp14:anchorId="5F60B3CC" wp14:editId="497AC6C5">
             <wp:simplePos x="0" y="0"/>
             <wp:positionH relativeFrom="column">
-              <wp:posOffset>0</wp:posOffset>
+              <wp:posOffset>667385</wp:posOffset>
             </wp:positionH>
             <wp:positionV relativeFrom="paragraph">
-              <wp:posOffset>467995</wp:posOffset>
+              <wp:posOffset>1055177</wp:posOffset>
             </wp:positionV>
-            <wp:extent cx="5943600" cy="554355"/>
-            <wp:effectExtent l="0" t="0" r="0" b="0"/>
+            <wp:extent cx="4794250" cy="2661285"/>
+            <wp:effectExtent l="0" t="0" r="6350" b="5715"/>
             <wp:wrapTopAndBottom/>
-            <wp:docPr id="7" name="Picture 7"/>
+            <wp:docPr id="10" name="Picture 10"/>
             <wp:cNvGraphicFramePr>
               <a:graphicFrameLocks xmlns:a="http://schemas.openxmlformats.org/drawingml/2006/main" noChangeAspect="1"/>
             </wp:cNvGraphicFramePr>
@@ -3345,6 +3806,817 @@
                   <pic:spPr bwMode="auto">
                     <a:xfrm>
                       <a:off x="0" y="0"/>
+                      <a:ext cx="4794250" cy="2661285"/>
+                    </a:xfrm>
+                    <a:prstGeom prst="rect">
+                      <a:avLst/>
+                    </a:prstGeom>
+                    <a:noFill/>
+                  </pic:spPr>
+                </pic:pic>
+              </a:graphicData>
+            </a:graphic>
+          </wp:anchor>
+        </w:drawing>
+      </w:r>
+      <w:r>
+        <w:rPr>
+          <w:b/>
+          <w:bCs/>
+          <w:sz w:val="28"/>
+          <w:szCs w:val="28"/>
+        </w:rPr>
+        <w:t>Stemming or Lemmatization</w:t>
+      </w:r>
+      <w:r>
+        <w:rPr>
+          <w:b/>
+          <w:bCs/>
+          <w:sz w:val="28"/>
+          <w:szCs w:val="28"/>
+        </w:rPr>
+        <w:t xml:space="preserve"> – </w:t>
+      </w:r>
+      <w:r>
+        <w:rPr>
+          <w:sz w:val="28"/>
+          <w:szCs w:val="28"/>
+        </w:rPr>
+        <w:t xml:space="preserve">both techniques are used to reduce words to their base forms. Stemming removes suffixes from words to identify their root form, while lemmatization reduces the word into a linguistically valid form. </w:t>
+      </w:r>
+    </w:p>
+    <w:p>
+      <w:pPr>
+        <w:pStyle w:val="Heading2"/>
+        <w:rPr>
+          <w:sz w:val="36"/>
+          <w:szCs w:val="36"/>
+        </w:rPr>
+      </w:pPr>
+      <w:bookmarkStart w:id="14" w:name="_Toc216749828"/>
+      <w:r>
+        <w:rPr>
+          <w:sz w:val="36"/>
+          <w:szCs w:val="36"/>
+        </w:rPr>
+        <w:t>How does NLP work?</w:t>
+      </w:r>
+      <w:bookmarkEnd w:id="14"/>
+    </w:p>
+    <w:p>
+      <w:r>
+        <w:rPr>
+          <w:noProof/>
+        </w:rPr>
+        <mc:AlternateContent>
+          <mc:Choice Requires="wps">
+            <w:drawing>
+              <wp:inline distT="0" distB="0" distL="0" distR="0" wp14:anchorId="7ECE56E2" wp14:editId="127C59BA">
+                <wp:extent cx="302260" cy="302260"/>
+                <wp:effectExtent l="0" t="0" r="0" b="0"/>
+                <wp:docPr id="11" name="Rectangle 11" descr="How NLP works?"/>
+                <wp:cNvGraphicFramePr>
+                  <a:graphicFrameLocks xmlns:a="http://schemas.openxmlformats.org/drawingml/2006/main" noChangeAspect="1"/>
+                </wp:cNvGraphicFramePr>
+                <a:graphic xmlns:a="http://schemas.openxmlformats.org/drawingml/2006/main">
+                  <a:graphicData uri="http://schemas.microsoft.com/office/word/2010/wordprocessingShape">
+                    <wps:wsp>
+                      <wps:cNvSpPr>
+                        <a:spLocks noChangeAspect="1" noChangeArrowheads="1"/>
+                      </wps:cNvSpPr>
+                      <wps:spPr bwMode="auto">
+                        <a:xfrm>
+                          <a:off x="0" y="0"/>
+                          <a:ext cx="302260" cy="302260"/>
+                        </a:xfrm>
+                        <a:prstGeom prst="rect">
+                          <a:avLst/>
+                        </a:prstGeom>
+                        <a:noFill/>
+                        <a:ln>
+                          <a:noFill/>
+                        </a:ln>
+                        <a:extLst>
+                          <a:ext uri="{909E8E84-426E-40DD-AFC4-6F175D3DCCD1}">
+                            <a14:hiddenFill xmlns:a14="http://schemas.microsoft.com/office/drawing/2010/main">
+                              <a:solidFill>
+                                <a:srgbClr val="FFFFFF"/>
+                              </a:solidFill>
+                            </a14:hiddenFill>
+                          </a:ext>
+                          <a:ext uri="{91240B29-F687-4F45-9708-019B960494DF}">
+                            <a14:hiddenLine xmlns:a14="http://schemas.microsoft.com/office/drawing/2010/main" w="9525">
+                              <a:solidFill>
+                                <a:srgbClr val="000000"/>
+                              </a:solidFill>
+                              <a:miter lim="800000"/>
+                              <a:headEnd/>
+                              <a:tailEnd/>
+                            </a14:hiddenLine>
+                          </a:ext>
+                        </a:extLst>
+                      </wps:spPr>
+                      <wps:bodyPr rot="0" vert="horz" wrap="square" lIns="91440" tIns="45720" rIns="91440" bIns="45720" anchor="t" anchorCtr="0" upright="1">
+                        <a:noAutofit/>
+                      </wps:bodyPr>
+                    </wps:wsp>
+                  </a:graphicData>
+                </a:graphic>
+              </wp:inline>
+            </w:drawing>
+          </mc:Choice>
+          <mc:Fallback>
+            <w:pict>
+              <v:rect w14:anchorId="03F094EF" id="Rectangle 11" o:spid="_x0000_s1026" alt="How NLP works?" style="width:23.8pt;height:23.8pt;visibility:visible;mso-wrap-style:square;mso-left-percent:-10001;mso-top-percent:-10001;mso-position-horizontal:absolute;mso-position-horizontal-relative:char;mso-position-vertical:absolute;mso-position-vertical-relative:line;mso-left-percent:-10001;mso-top-percent:-10001;v-text-anchor:top" o:gfxdata="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" filled="f" stroked="f">
+                <o:lock v:ext="edit" aspectratio="t"/>
+                <w10:anchorlock/>
+              </v:rect>
+            </w:pict>
+          </mc:Fallback>
+        </mc:AlternateContent>
+      </w:r>
+    </w:p>
+    <w:p>
+      <w:pPr>
+        <w:rPr>
+          <w:b/>
+          <w:bCs/>
+          <w:sz w:val="28"/>
+          <w:szCs w:val="28"/>
+        </w:rPr>
+      </w:pPr>
+    </w:p>
+    <w:p/>
+    <w:p>
+      <w:pPr>
+        <w:rPr>
+          <w:sz w:val="40"/>
+          <w:szCs w:val="40"/>
+        </w:rPr>
+      </w:pPr>
+    </w:p>
+    <w:p>
+      <w:pPr>
+        <w:rPr>
+          <w:sz w:val="40"/>
+          <w:szCs w:val="40"/>
+        </w:rPr>
+      </w:pPr>
+      <w:r>
+        <w:rPr>
+          <w:noProof/>
+        </w:rPr>
+        <w:lastRenderedPageBreak/>
+        <w:drawing>
+          <wp:anchor distT="0" distB="0" distL="114300" distR="114300" simplePos="0" relativeHeight="251670528" behindDoc="0" locked="0" layoutInCell="1" allowOverlap="1" wp14:anchorId="36130AC7" wp14:editId="7A399B94">
+            <wp:simplePos x="0" y="0"/>
+            <wp:positionH relativeFrom="margin">
+              <wp:posOffset>830574</wp:posOffset>
+            </wp:positionH>
+            <wp:positionV relativeFrom="paragraph">
+              <wp:posOffset>87316</wp:posOffset>
+            </wp:positionV>
+            <wp:extent cx="4182110" cy="4182110"/>
+            <wp:effectExtent l="0" t="0" r="8890" b="8890"/>
+            <wp:wrapTopAndBottom/>
+            <wp:docPr id="12" name="Picture 12"/>
+            <wp:cNvGraphicFramePr>
+              <a:graphicFrameLocks xmlns:a="http://schemas.openxmlformats.org/drawingml/2006/main" noChangeAspect="1"/>
+            </wp:cNvGraphicFramePr>
+            <a:graphic xmlns:a="http://schemas.openxmlformats.org/drawingml/2006/main">
+              <a:graphicData uri="http://schemas.openxmlformats.org/drawingml/2006/picture">
+                <pic:pic xmlns:pic="http://schemas.openxmlformats.org/drawingml/2006/picture">
+                  <pic:nvPicPr>
+                    <pic:cNvPr id="0" name="Picture 3"/>
+                    <pic:cNvPicPr>
+                      <a:picLocks noChangeAspect="1" noChangeArrowheads="1"/>
+                    </pic:cNvPicPr>
+                  </pic:nvPicPr>
+                  <pic:blipFill>
+                    <a:blip r:embed="rId9" cstate="print">
+                      <a:extLst>
+                        <a:ext uri="{28A0092B-C50C-407E-A947-70E740481C1C}">
+                          <a14:useLocalDpi xmlns:a14="http://schemas.microsoft.com/office/drawing/2010/main" val="0"/>
+                        </a:ext>
+                      </a:extLst>
+                    </a:blip>
+                    <a:srcRect/>
+                    <a:stretch>
+                      <a:fillRect/>
+                    </a:stretch>
+                  </pic:blipFill>
+                  <pic:spPr bwMode="auto">
+                    <a:xfrm>
+                      <a:off x="0" y="0"/>
+                      <a:ext cx="4182110" cy="4182110"/>
+                    </a:xfrm>
+                    <a:prstGeom prst="rect">
+                      <a:avLst/>
+                    </a:prstGeom>
+                    <a:noFill/>
+                  </pic:spPr>
+                </pic:pic>
+              </a:graphicData>
+            </a:graphic>
+          </wp:anchor>
+        </w:drawing>
+      </w:r>
+    </w:p>
+    <w:p>
+      <w:pPr>
+        <w:rPr>
+          <w:sz w:val="28"/>
+          <w:szCs w:val="28"/>
+        </w:rPr>
+      </w:pPr>
+      <w:r>
+        <w:rPr>
+          <w:sz w:val="28"/>
+          <w:szCs w:val="28"/>
+        </w:rPr>
+        <w:t>The first step in an NLP task is input preprocessing, where the text is cleaned and structured for analysis, often through tokenization, stop word removal and stemming/lemmatization. This step helps reduce complexity. The next step is the feature extraction – key characteristics are being identified. This step transforms the raw data into a numerical format suitable for machine learning models. Techniques used for feature extraction are Bag or Words</w:t>
+      </w:r>
+      <w:r>
+        <w:rPr>
+          <w:sz w:val="28"/>
+          <w:szCs w:val="28"/>
+        </w:rPr>
+        <w:t xml:space="preserve"> (represents text as a collection of words, each word is represented by its frequency)</w:t>
+      </w:r>
+      <w:r>
+        <w:rPr>
+          <w:sz w:val="28"/>
+          <w:szCs w:val="28"/>
+        </w:rPr>
+        <w:t xml:space="preserve">, </w:t>
+      </w:r>
+      <w:r>
+        <w:rPr>
+          <w:sz w:val="28"/>
+          <w:szCs w:val="28"/>
+        </w:rPr>
+        <w:t>Term Frequency – Inverse Document Frequency</w:t>
+      </w:r>
+      <w:r>
+        <w:rPr>
+          <w:sz w:val="28"/>
+          <w:szCs w:val="28"/>
+        </w:rPr>
+        <w:t xml:space="preserve"> </w:t>
+      </w:r>
+      <w:r>
+        <w:rPr>
+          <w:sz w:val="28"/>
+          <w:szCs w:val="28"/>
+        </w:rPr>
+        <w:t>(helps identify key words) and Word embeddings</w:t>
+      </w:r>
+      <w:r>
+        <w:rPr>
+          <w:sz w:val="28"/>
+          <w:szCs w:val="28"/>
+        </w:rPr>
+        <w:t xml:space="preserve"> </w:t>
+      </w:r>
+      <w:r>
+        <w:rPr>
+          <w:sz w:val="28"/>
+          <w:szCs w:val="28"/>
+        </w:rPr>
+        <w:t xml:space="preserve">(used to capture the meaning of words by mapping them into high-dimensional vectors). The third step in the pipeline is modeling. Based on the complexity of the task, there are 3 different types of models – rule-based, machine learning and deep-learning models. The rule-based ones </w:t>
+      </w:r>
+      <w:r>
+        <w:rPr>
+          <w:sz w:val="28"/>
+          <w:szCs w:val="28"/>
+        </w:rPr>
+        <w:t xml:space="preserve">are </w:t>
+      </w:r>
+      <w:r>
+        <w:rPr>
+          <w:sz w:val="28"/>
+          <w:szCs w:val="28"/>
+        </w:rPr>
+        <w:t>the simplest – they rely in pre-defined rules to make decisions. The machine learning</w:t>
+      </w:r>
+      <w:r>
+        <w:rPr>
+          <w:sz w:val="28"/>
+          <w:szCs w:val="28"/>
+        </w:rPr>
+        <w:t xml:space="preserve"> models</w:t>
+      </w:r>
+      <w:r>
+        <w:rPr>
+          <w:sz w:val="28"/>
+          <w:szCs w:val="28"/>
+        </w:rPr>
+        <w:t xml:space="preserve"> </w:t>
+      </w:r>
+      <w:r>
+        <w:rPr>
+          <w:sz w:val="28"/>
+          <w:szCs w:val="28"/>
+        </w:rPr>
+        <w:t xml:space="preserve">identify patterns and make predictions. The most complex ones, such as BERT and GPT, consider the whole context and allow a more accurate text understanding. After the model </w:t>
+      </w:r>
+      <w:r>
+        <w:rPr>
+          <w:sz w:val="28"/>
+          <w:szCs w:val="28"/>
+        </w:rPr>
+        <w:lastRenderedPageBreak/>
+        <w:t>made its prediction, it converts it back to a human-readable text, which might involve generating responses, translating text or summarizing information.</w:t>
+      </w:r>
+    </w:p>
+    <w:p>
+      <w:pPr>
+        <w:pStyle w:val="Heading2"/>
+        <w:rPr>
+          <w:sz w:val="36"/>
+          <w:szCs w:val="36"/>
+        </w:rPr>
+      </w:pPr>
+      <w:bookmarkStart w:id="15" w:name="_Toc216749829"/>
+      <w:r>
+        <w:rPr>
+          <w:sz w:val="36"/>
+          <w:szCs w:val="36"/>
+        </w:rPr>
+        <w:t>Understanding the difference between Human Language Processing and NLP</w:t>
+      </w:r>
+      <w:bookmarkEnd w:id="15"/>
+    </w:p>
+    <w:p>
+      <w:pPr>
+        <w:rPr>
+          <w:sz w:val="28"/>
+          <w:szCs w:val="28"/>
+        </w:rPr>
+      </w:pPr>
+      <w:r>
+        <w:rPr>
+          <w:sz w:val="28"/>
+          <w:szCs w:val="28"/>
+        </w:rPr>
+        <w:t xml:space="preserve">In research about the difference between the HLP and NLP, </w:t>
+      </w:r>
+      <w:r>
+        <w:rPr>
+          <w:sz w:val="28"/>
+          <w:szCs w:val="28"/>
+        </w:rPr>
+        <w:t xml:space="preserve">several experiments </w:t>
+      </w:r>
+      <w:r>
+        <w:rPr>
+          <w:sz w:val="28"/>
+          <w:szCs w:val="28"/>
+        </w:rPr>
+        <w:t xml:space="preserve">were conducted with </w:t>
+      </w:r>
+      <w:r>
+        <w:rPr>
+          <w:sz w:val="28"/>
+          <w:szCs w:val="28"/>
+        </w:rPr>
+        <w:t xml:space="preserve">the chatting robot </w:t>
+      </w:r>
+      <w:proofErr w:type="spellStart"/>
+      <w:r>
+        <w:rPr>
+          <w:sz w:val="28"/>
+          <w:szCs w:val="28"/>
+        </w:rPr>
+        <w:t>Replika</w:t>
+      </w:r>
+      <w:proofErr w:type="spellEnd"/>
+      <w:r>
+        <w:rPr>
+          <w:sz w:val="28"/>
+          <w:szCs w:val="28"/>
+        </w:rPr>
+        <w:t xml:space="preserve"> – users can customize their own AI friend and form an emotional connection.  First, the authors tested the bot’s answering time -each time it responded directly to the question in less than 5 seconds. Next, they tested the contextual understanding by asking questions with pronouns – the bot managed to accurately reply each time. </w:t>
+      </w:r>
+      <w:r>
+        <w:rPr>
+          <w:sz w:val="28"/>
+          <w:szCs w:val="28"/>
+        </w:rPr>
+        <w:t xml:space="preserve">In the next experiment, the chatbot was given questions with typos to check whether it would ask the user to determine what he was trying to say. </w:t>
+      </w:r>
+      <w:proofErr w:type="spellStart"/>
+      <w:r>
+        <w:rPr>
+          <w:sz w:val="28"/>
+          <w:szCs w:val="28"/>
+        </w:rPr>
+        <w:t>Replika</w:t>
+      </w:r>
+      <w:proofErr w:type="spellEnd"/>
+      <w:r>
+        <w:rPr>
+          <w:sz w:val="28"/>
+          <w:szCs w:val="28"/>
+        </w:rPr>
+        <w:t xml:space="preserve"> did not ask for clarity and therefore did not provide a proper answer, which shows that the bot lacks the ability to repair misspelled words. Overall, these experiments show tha</w:t>
+      </w:r>
+      <w:r>
+        <w:rPr>
+          <w:sz w:val="28"/>
+          <w:szCs w:val="28"/>
+        </w:rPr>
+        <w:t xml:space="preserve">t </w:t>
+      </w:r>
+      <w:proofErr w:type="spellStart"/>
+      <w:r>
+        <w:rPr>
+          <w:sz w:val="28"/>
+          <w:szCs w:val="28"/>
+        </w:rPr>
+        <w:t>Replika</w:t>
+      </w:r>
+      <w:proofErr w:type="spellEnd"/>
+      <w:r>
+        <w:rPr>
+          <w:sz w:val="28"/>
+          <w:szCs w:val="28"/>
+        </w:rPr>
+        <w:t xml:space="preserve"> can imitate human-like conversations by providing quick and context-based answers. However, the third experiment shows that its understanding is less flexible than HLP, because it does not reliably repair typos or ask clarifying questions.</w:t>
+      </w:r>
+      <w:r>
+        <w:rPr>
+          <w:sz w:val="28"/>
+          <w:szCs w:val="28"/>
+        </w:rPr>
+        <w:t xml:space="preserve"> In conclusion, the experiments are an example of how noise and clarification behavior differ between human and machine language processing.</w:t>
+      </w:r>
+    </w:p>
+    <w:p>
+      <w:pPr>
+        <w:pStyle w:val="Heading1"/>
+        <w:rPr>
+          <w:sz w:val="40"/>
+          <w:szCs w:val="40"/>
+        </w:rPr>
+      </w:pPr>
+      <w:bookmarkStart w:id="16" w:name="_Toc216749830"/>
+      <w:r>
+        <w:rPr>
+          <w:sz w:val="40"/>
+          <w:szCs w:val="40"/>
+        </w:rPr>
+        <w:t>BERT</w:t>
+      </w:r>
+      <w:bookmarkEnd w:id="16"/>
+    </w:p>
+    <w:p>
+      <w:pPr>
+        <w:pStyle w:val="Heading2"/>
+        <w:rPr>
+          <w:sz w:val="36"/>
+          <w:szCs w:val="36"/>
+        </w:rPr>
+      </w:pPr>
+      <w:bookmarkStart w:id="17" w:name="_Toc216749831"/>
+      <w:r>
+        <w:rPr>
+          <w:sz w:val="36"/>
+          <w:szCs w:val="36"/>
+        </w:rPr>
+        <w:t>What is BERT?</w:t>
+      </w:r>
+      <w:bookmarkEnd w:id="17"/>
+    </w:p>
+    <w:p>
+      <w:pPr>
+        <w:rPr>
+          <w:sz w:val="28"/>
+          <w:szCs w:val="28"/>
+        </w:rPr>
+      </w:pPr>
+      <w:r>
+        <w:rPr>
+          <w:sz w:val="28"/>
+          <w:szCs w:val="28"/>
+        </w:rPr>
+        <w:t xml:space="preserve">BERT is a transformer-based model that uses a stack of encoders to learn the relationships between the words in a sentence. Instead of reading the text from left to right, it goes through the whole text and forms a contextual understanding. </w:t>
+      </w:r>
+    </w:p>
+    <w:p>
+      <w:pPr>
+        <w:pStyle w:val="Heading2"/>
+        <w:rPr>
+          <w:sz w:val="36"/>
+          <w:szCs w:val="36"/>
+        </w:rPr>
+      </w:pPr>
+      <w:bookmarkStart w:id="18" w:name="_Toc216749832"/>
+      <w:r>
+        <w:rPr>
+          <w:sz w:val="36"/>
+          <w:szCs w:val="36"/>
+        </w:rPr>
+        <w:t>BERT-based models</w:t>
+      </w:r>
+      <w:bookmarkEnd w:id="18"/>
+    </w:p>
+    <w:p>
+      <w:pPr>
+        <w:pStyle w:val="ListParagraph"/>
+        <w:numPr>
+          <w:ilvl w:val="0"/>
+          <w:numId w:val="11"/>
+        </w:numPr>
+        <w:rPr>
+          <w:b/>
+          <w:bCs/>
+          <w:sz w:val="28"/>
+          <w:szCs w:val="28"/>
+        </w:rPr>
+      </w:pPr>
+      <w:proofErr w:type="spellStart"/>
+      <w:r>
+        <w:rPr>
+          <w:b/>
+          <w:bCs/>
+          <w:sz w:val="28"/>
+          <w:szCs w:val="28"/>
+        </w:rPr>
+        <w:t>DistilBERT</w:t>
+      </w:r>
+      <w:proofErr w:type="spellEnd"/>
+      <w:r>
+        <w:rPr>
+          <w:b/>
+          <w:bCs/>
+          <w:sz w:val="28"/>
+          <w:szCs w:val="28"/>
+        </w:rPr>
+        <w:t xml:space="preserve"> – </w:t>
+      </w:r>
+      <w:r>
+        <w:rPr>
+          <w:sz w:val="28"/>
+          <w:szCs w:val="28"/>
+        </w:rPr>
+        <w:t>trained through knowledge distillation (machine learning technique that transfers knowledge from a complex “teacher” model to a smaller “student” model); smaller and faster</w:t>
+      </w:r>
+    </w:p>
+    <w:p>
+      <w:pPr>
+        <w:pStyle w:val="ListParagraph"/>
+        <w:numPr>
+          <w:ilvl w:val="0"/>
+          <w:numId w:val="11"/>
+        </w:numPr>
+        <w:rPr>
+          <w:b/>
+          <w:bCs/>
+          <w:sz w:val="28"/>
+          <w:szCs w:val="28"/>
+        </w:rPr>
+      </w:pPr>
+      <w:r>
+        <w:rPr>
+          <w:b/>
+          <w:bCs/>
+          <w:sz w:val="28"/>
+          <w:szCs w:val="28"/>
+        </w:rPr>
+        <w:t>ALBERT</w:t>
+      </w:r>
+      <w:r>
+        <w:rPr>
+          <w:b/>
+          <w:bCs/>
+          <w:sz w:val="28"/>
+          <w:szCs w:val="28"/>
+        </w:rPr>
+        <w:t xml:space="preserve"> – </w:t>
+      </w:r>
+      <w:r>
+        <w:rPr>
+          <w:sz w:val="28"/>
+          <w:szCs w:val="28"/>
+        </w:rPr>
+        <w:t>uses 2 parameter-reduction techniques to address problems related to memory limitations, longer training time and unexpected model degradation in BERT</w:t>
+      </w:r>
+    </w:p>
+    <w:p>
+      <w:pPr>
+        <w:pStyle w:val="ListParagraph"/>
+        <w:numPr>
+          <w:ilvl w:val="0"/>
+          <w:numId w:val="11"/>
+        </w:numPr>
+        <w:rPr>
+          <w:b/>
+          <w:bCs/>
+          <w:sz w:val="28"/>
+          <w:szCs w:val="28"/>
+        </w:rPr>
+      </w:pPr>
+      <w:proofErr w:type="spellStart"/>
+      <w:r>
+        <w:rPr>
+          <w:b/>
+          <w:bCs/>
+          <w:sz w:val="28"/>
+          <w:szCs w:val="28"/>
+        </w:rPr>
+        <w:lastRenderedPageBreak/>
+        <w:t>ROBERTa</w:t>
+      </w:r>
+      <w:proofErr w:type="spellEnd"/>
+      <w:r>
+        <w:rPr>
+          <w:b/>
+          <w:bCs/>
+          <w:sz w:val="28"/>
+          <w:szCs w:val="28"/>
+        </w:rPr>
+        <w:t xml:space="preserve"> – </w:t>
+      </w:r>
+      <w:r>
+        <w:rPr>
+          <w:sz w:val="28"/>
+          <w:szCs w:val="28"/>
+        </w:rPr>
+        <w:t>uses dynamic masking and longer training to improve the performance</w:t>
+      </w:r>
+    </w:p>
+    <w:p>
+      <w:pPr>
+        <w:rPr>
+          <w:sz w:val="28"/>
+          <w:szCs w:val="28"/>
+        </w:rPr>
+      </w:pPr>
+      <w:r>
+        <w:rPr>
+          <w:sz w:val="28"/>
+          <w:szCs w:val="28"/>
+        </w:rPr>
+        <w:t>All models retain the transformer structure but are focused on improving the model’s efficiency.</w:t>
+      </w:r>
+    </w:p>
+    <w:p>
+      <w:pPr>
+        <w:pStyle w:val="Heading2"/>
+        <w:rPr>
+          <w:sz w:val="36"/>
+          <w:szCs w:val="36"/>
+        </w:rPr>
+      </w:pPr>
+      <w:bookmarkStart w:id="19" w:name="_Toc216749833"/>
+      <w:r>
+        <w:rPr>
+          <w:sz w:val="36"/>
+          <w:szCs w:val="36"/>
+        </w:rPr>
+        <w:t xml:space="preserve">How </w:t>
+      </w:r>
+      <w:r>
+        <w:rPr>
+          <w:sz w:val="36"/>
+          <w:szCs w:val="36"/>
+        </w:rPr>
+        <w:t xml:space="preserve">does </w:t>
+      </w:r>
+      <w:r>
+        <w:rPr>
+          <w:sz w:val="36"/>
+          <w:szCs w:val="36"/>
+        </w:rPr>
+        <w:t xml:space="preserve">BERT </w:t>
+      </w:r>
+      <w:r>
+        <w:rPr>
+          <w:sz w:val="36"/>
+          <w:szCs w:val="36"/>
+        </w:rPr>
+        <w:t>process</w:t>
+      </w:r>
+      <w:r>
+        <w:rPr>
+          <w:sz w:val="36"/>
+          <w:szCs w:val="36"/>
+        </w:rPr>
+        <w:t xml:space="preserve"> the input?</w:t>
+      </w:r>
+      <w:bookmarkEnd w:id="19"/>
+    </w:p>
+    <w:p>
+      <w:pPr>
+        <w:rPr>
+          <w:sz w:val="28"/>
+          <w:szCs w:val="28"/>
+        </w:rPr>
+      </w:pPr>
+      <w:r>
+        <w:rPr>
+          <w:sz w:val="28"/>
+          <w:szCs w:val="28"/>
+        </w:rPr>
+        <w:t>The model cannot work with raw text. It relies on a structured and tokenized input to be able to understand and analyze the given text.</w:t>
+      </w:r>
+    </w:p>
+    <w:p>
+      <w:pPr>
+        <w:pStyle w:val="Heading3"/>
+        <w:rPr>
+          <w:sz w:val="32"/>
+          <w:szCs w:val="32"/>
+        </w:rPr>
+      </w:pPr>
+      <w:bookmarkStart w:id="20" w:name="_Toc216749834"/>
+      <w:r>
+        <w:rPr>
+          <w:sz w:val="32"/>
+          <w:szCs w:val="32"/>
+        </w:rPr>
+        <w:t>Tokenization</w:t>
+      </w:r>
+      <w:bookmarkEnd w:id="20"/>
+    </w:p>
+    <w:p>
+      <w:pPr>
+        <w:rPr>
+          <w:sz w:val="28"/>
+          <w:szCs w:val="28"/>
+        </w:rPr>
+      </w:pPr>
+      <w:r>
+        <w:rPr>
+          <w:sz w:val="28"/>
+          <w:szCs w:val="28"/>
+        </w:rPr>
+        <w:t>The first step in this process is called “</w:t>
+      </w:r>
+      <w:proofErr w:type="spellStart"/>
+      <w:r>
+        <w:rPr>
+          <w:sz w:val="28"/>
+          <w:szCs w:val="28"/>
+        </w:rPr>
+        <w:t>WordPiece</w:t>
+      </w:r>
+      <w:proofErr w:type="spellEnd"/>
+      <w:r>
+        <w:rPr>
+          <w:sz w:val="28"/>
+          <w:szCs w:val="28"/>
+        </w:rPr>
+        <w:t xml:space="preserve">” tokenization – breaks the text into sub-word units to limit the vocabulary size and handle rare or unseen words. </w:t>
+      </w:r>
+      <w:r>
+        <w:rPr>
+          <w:noProof/>
+          <w:sz w:val="28"/>
+          <w:szCs w:val="28"/>
+        </w:rPr>
+        <w:drawing>
+          <wp:anchor distT="0" distB="0" distL="114300" distR="114300" simplePos="0" relativeHeight="251667456" behindDoc="0" locked="0" layoutInCell="1" allowOverlap="1" wp14:anchorId="21EB3A98" wp14:editId="7AEE33A0">
+            <wp:simplePos x="0" y="0"/>
+            <wp:positionH relativeFrom="column">
+              <wp:posOffset>0</wp:posOffset>
+            </wp:positionH>
+            <wp:positionV relativeFrom="paragraph">
+              <wp:posOffset>467995</wp:posOffset>
+            </wp:positionV>
+            <wp:extent cx="5943600" cy="554355"/>
+            <wp:effectExtent l="0" t="0" r="0" b="0"/>
+            <wp:wrapTopAndBottom/>
+            <wp:docPr id="7" name="Picture 7"/>
+            <wp:cNvGraphicFramePr>
+              <a:graphicFrameLocks xmlns:a="http://schemas.openxmlformats.org/drawingml/2006/main" noChangeAspect="1"/>
+            </wp:cNvGraphicFramePr>
+            <a:graphic xmlns:a="http://schemas.openxmlformats.org/drawingml/2006/main">
+              <a:graphicData uri="http://schemas.openxmlformats.org/drawingml/2006/picture">
+                <pic:pic xmlns:pic="http://schemas.openxmlformats.org/drawingml/2006/picture">
+                  <pic:nvPicPr>
+                    <pic:cNvPr id="0" name="Picture 2"/>
+                    <pic:cNvPicPr>
+                      <a:picLocks noChangeAspect="1" noChangeArrowheads="1"/>
+                    </pic:cNvPicPr>
+                  </pic:nvPicPr>
+                  <pic:blipFill>
+                    <a:blip r:embed="rId10">
+                      <a:extLst>
+                        <a:ext uri="{28A0092B-C50C-407E-A947-70E740481C1C}">
+                          <a14:useLocalDpi xmlns:a14="http://schemas.microsoft.com/office/drawing/2010/main" val="0"/>
+                        </a:ext>
+                      </a:extLst>
+                    </a:blip>
+                    <a:srcRect/>
+                    <a:stretch>
+                      <a:fillRect/>
+                    </a:stretch>
+                  </pic:blipFill>
+                  <pic:spPr bwMode="auto">
+                    <a:xfrm>
+                      <a:off x="0" y="0"/>
                       <a:ext cx="5943600" cy="554355"/>
                     </a:xfrm>
                     <a:prstGeom prst="rect">
@@ -3432,16 +4704,15 @@
           <w:szCs w:val="32"/>
         </w:rPr>
       </w:pPr>
-      <w:bookmarkStart w:id="16" w:name="_Toc215832382"/>
+      <w:bookmarkStart w:id="21" w:name="_Toc216749835"/>
       <w:r>
         <w:rPr>
           <w:sz w:val="32"/>
           <w:szCs w:val="32"/>
         </w:rPr>
-        <w:lastRenderedPageBreak/>
         <w:t>Embeddings</w:t>
       </w:r>
-      <w:bookmarkEnd w:id="16"/>
+      <w:bookmarkEnd w:id="21"/>
       <w:r>
         <w:rPr>
           <w:sz w:val="32"/>
@@ -3487,7 +4758,7 @@
                     </pic:cNvPicPr>
                   </pic:nvPicPr>
                   <pic:blipFill>
-                    <a:blip r:embed="rId9">
+                    <a:blip r:embed="rId11">
                       <a:extLst>
                         <a:ext uri="{28A0092B-C50C-407E-A947-70E740481C1C}">
                           <a14:useLocalDpi xmlns:a14="http://schemas.microsoft.com/office/drawing/2010/main" val="0"/>
@@ -3539,7 +4810,7 @@
           <w:szCs w:val="32"/>
         </w:rPr>
       </w:pPr>
-      <w:bookmarkStart w:id="17" w:name="_Toc215832383"/>
+      <w:bookmarkStart w:id="22" w:name="_Toc216749836"/>
       <w:r>
         <w:rPr>
           <w:sz w:val="32"/>
@@ -3547,7 +4818,7 @@
         </w:rPr>
         <w:t>Training</w:t>
       </w:r>
-      <w:bookmarkEnd w:id="17"/>
+      <w:bookmarkEnd w:id="22"/>
     </w:p>
     <w:p>
       <w:pPr>
@@ -3665,12 +4936,11 @@
           <w:szCs w:val="40"/>
         </w:rPr>
       </w:pPr>
-      <w:bookmarkStart w:id="18" w:name="_Toc215832384"/>
+      <w:bookmarkStart w:id="23" w:name="_Toc216749837"/>
       <w:r>
         <w:rPr>
           <w:noProof/>
         </w:rPr>
-        <w:lastRenderedPageBreak/>
         <w:drawing>
           <wp:anchor distT="0" distB="0" distL="114300" distR="114300" simplePos="0" relativeHeight="251663360" behindDoc="0" locked="0" layoutInCell="1" allowOverlap="1" wp14:anchorId="753E6F19" wp14:editId="5E42FC53">
             <wp:simplePos x="0" y="0"/>
@@ -3697,7 +4967,7 @@
                     </pic:cNvPicPr>
                   </pic:nvPicPr>
                   <pic:blipFill>
-                    <a:blip r:embed="rId10">
+                    <a:blip r:embed="rId12">
                       <a:extLst>
                         <a:ext uri="{28A0092B-C50C-407E-A947-70E740481C1C}">
                           <a14:useLocalDpi xmlns:a14="http://schemas.microsoft.com/office/drawing/2010/main" val="0"/>
@@ -3735,7 +5005,7 @@
         </w:rPr>
         <w:t>Red Cross</w:t>
       </w:r>
-      <w:bookmarkEnd w:id="18"/>
+      <w:bookmarkEnd w:id="23"/>
     </w:p>
     <w:p/>
     <w:p>
@@ -3842,6 +5112,7 @@
           <w:sz w:val="28"/>
           <w:szCs w:val="28"/>
         </w:rPr>
+        <w:lastRenderedPageBreak/>
         <w:t xml:space="preserve">Nowadays, the Red Cross provides several methods for people to contact them </w:t>
       </w:r>
       <w:r>
@@ -3948,15 +5219,7 @@
           <w:sz w:val="28"/>
           <w:szCs w:val="28"/>
         </w:rPr>
-        <w:t xml:space="preserve"> to analyze and interpret social media content and emphasizes the need for an AI </w:t>
-      </w:r>
-      <w:r>
-        <w:rPr>
-          <w:sz w:val="28"/>
-          <w:szCs w:val="28"/>
-        </w:rPr>
-        <w:lastRenderedPageBreak/>
-        <w:t xml:space="preserve">solution that can classify messages, allowing staff to focus their time and effort on the crucial cases. </w:t>
+        <w:t xml:space="preserve"> to analyze and interpret social media content and emphasizes the need for an AI solution that can classify messages, allowing staff to focus their time and effort on the crucial cases. </w:t>
       </w:r>
     </w:p>
     <w:p>
@@ -3967,7 +5230,7 @@
           <w:szCs w:val="40"/>
         </w:rPr>
       </w:pPr>
-      <w:bookmarkStart w:id="19" w:name="_Toc215832385"/>
+      <w:bookmarkStart w:id="24" w:name="_Toc216749838"/>
       <w:r>
         <w:rPr>
           <w:noProof/>
@@ -3998,7 +5261,7 @@
                     </pic:cNvPicPr>
                   </pic:nvPicPr>
                   <pic:blipFill>
-                    <a:blip r:embed="rId11">
+                    <a:blip r:embed="rId13">
                       <a:extLst>
                         <a:ext uri="{28A0092B-C50C-407E-A947-70E740481C1C}">
                           <a14:useLocalDpi xmlns:a14="http://schemas.microsoft.com/office/drawing/2010/main" val="0"/>
@@ -4036,7 +5299,7 @@
         </w:rPr>
         <w:t>Doctors Without Borders</w:t>
       </w:r>
-      <w:bookmarkEnd w:id="19"/>
+      <w:bookmarkEnd w:id="24"/>
     </w:p>
     <w:p/>
     <w:p>
@@ -4088,7 +5351,15 @@
           <w:sz w:val="28"/>
           <w:szCs w:val="28"/>
         </w:rPr>
-        <w:t>, independent medical humanitarian organization. MSF provides medical help to individuals affected by conflicts, disasters, epidemics or exclusion from healthcare. Currently, their team consists of more than 67,000 professionals from the medical, logistics, administration, communication and skilled trades fields</w:t>
+        <w:t xml:space="preserve">, independent medical humanitarian organization. MSF provides medical help to individuals affected by conflicts, disasters, epidemics or exclusion from healthcare. Currently, their team consists of more than 67,000 professionals </w:t>
+      </w:r>
+      <w:r>
+        <w:rPr>
+          <w:sz w:val="28"/>
+          <w:szCs w:val="28"/>
+        </w:rPr>
+        <w:lastRenderedPageBreak/>
+        <w:t>from the medical, logistics, administration, communication and skilled trades fields</w:t>
       </w:r>
       <w:r>
         <w:rPr>
@@ -4142,12 +5413,11 @@
           <w:szCs w:val="40"/>
         </w:rPr>
       </w:pPr>
-      <w:bookmarkStart w:id="20" w:name="_Toc215832386"/>
+      <w:bookmarkStart w:id="25" w:name="_Toc216749839"/>
       <w:r>
         <w:rPr>
           <w:noProof/>
         </w:rPr>
-        <w:lastRenderedPageBreak/>
         <w:drawing>
           <wp:anchor distT="0" distB="0" distL="114300" distR="114300" simplePos="0" relativeHeight="251664384" behindDoc="0" locked="0" layoutInCell="1" allowOverlap="1" wp14:anchorId="1ACE94BD" wp14:editId="0461A31B">
             <wp:simplePos x="0" y="0"/>
@@ -4174,7 +5444,7 @@
                     </pic:cNvPicPr>
                   </pic:nvPicPr>
                   <pic:blipFill>
-                    <a:blip r:embed="rId12">
+                    <a:blip r:embed="rId14">
                       <a:extLst>
                         <a:ext uri="{28A0092B-C50C-407E-A947-70E740481C1C}">
                           <a14:useLocalDpi xmlns:a14="http://schemas.microsoft.com/office/drawing/2010/main" val="0"/>
@@ -4215,7 +5485,7 @@
         </w:rPr>
         <w:t>Similar Tools</w:t>
       </w:r>
-      <w:bookmarkEnd w:id="20"/>
+      <w:bookmarkEnd w:id="25"/>
     </w:p>
     <w:p>
       <w:pPr>
@@ -4225,7 +5495,7 @@
           <w:szCs w:val="36"/>
         </w:rPr>
       </w:pPr>
-      <w:bookmarkStart w:id="21" w:name="_Toc215832387"/>
+      <w:bookmarkStart w:id="26" w:name="_Toc216749840"/>
       <w:r>
         <w:rPr>
           <w:sz w:val="36"/>
@@ -4233,7 +5503,7 @@
         </w:rPr>
         <w:t>Artificial Intelligence for Digital Response</w:t>
       </w:r>
-      <w:bookmarkEnd w:id="21"/>
+      <w:bookmarkEnd w:id="26"/>
     </w:p>
     <w:p/>
     <w:p>
@@ -4267,12 +5537,13 @@
           <w:szCs w:val="36"/>
         </w:rPr>
       </w:pPr>
-      <w:bookmarkStart w:id="22" w:name="_Toc215832388"/>
+      <w:bookmarkStart w:id="27" w:name="_Toc216749841"/>
       <w:r>
         <w:rPr>
           <w:sz w:val="36"/>
           <w:szCs w:val="36"/>
         </w:rPr>
+        <w:lastRenderedPageBreak/>
         <w:t xml:space="preserve">Red Cross </w:t>
       </w:r>
       <w:r>
@@ -4282,7 +5553,7 @@
         </w:rPr>
         <w:t>510</w:t>
       </w:r>
-      <w:bookmarkEnd w:id="22"/>
+      <w:bookmarkEnd w:id="27"/>
     </w:p>
     <w:p>
       <w:r>
@@ -4315,7 +5586,7 @@
                     </pic:cNvPicPr>
                   </pic:nvPicPr>
                   <pic:blipFill>
-                    <a:blip r:embed="rId13" cstate="print">
+                    <a:blip r:embed="rId15" cstate="print">
                       <a:extLst>
                         <a:ext uri="{28A0092B-C50C-407E-A947-70E740481C1C}">
                           <a14:useLocalDpi xmlns:a14="http://schemas.microsoft.com/office/drawing/2010/main" val="0"/>
@@ -4414,7 +5685,7 @@
           <w:szCs w:val="40"/>
         </w:rPr>
       </w:pPr>
-      <w:bookmarkStart w:id="23" w:name="_Toc215832389"/>
+      <w:bookmarkStart w:id="28" w:name="_Toc216749842"/>
       <w:r>
         <w:rPr>
           <w:sz w:val="40"/>
@@ -4443,7 +5714,7 @@
         </w:rPr>
         <w:t>Crisis Response</w:t>
       </w:r>
-      <w:bookmarkEnd w:id="23"/>
+      <w:bookmarkEnd w:id="28"/>
     </w:p>
     <w:p>
       <w:pPr>
@@ -4485,15 +5756,7 @@
           <w:sz w:val="28"/>
           <w:szCs w:val="28"/>
         </w:rPr>
-        <w:t xml:space="preserve">due to their complexity, they are often </w:t>
-      </w:r>
-      <w:r>
-        <w:rPr>
-          <w:sz w:val="28"/>
-          <w:szCs w:val="28"/>
-        </w:rPr>
-        <w:lastRenderedPageBreak/>
-        <w:t xml:space="preserve">referred to as black boxes. </w:t>
+        <w:t xml:space="preserve">due to their complexity, they are often referred to as black boxes. </w:t>
       </w:r>
       <w:proofErr w:type="spellStart"/>
       <w:r>
@@ -4567,6 +5830,7 @@
         <w:rPr>
           <w:noProof/>
         </w:rPr>
+        <w:lastRenderedPageBreak/>
         <w:drawing>
           <wp:anchor distT="0" distB="0" distL="114300" distR="114300" simplePos="0" relativeHeight="251666432" behindDoc="0" locked="0" layoutInCell="1" allowOverlap="1" wp14:anchorId="1FB1DDCC" wp14:editId="6DEA8387">
             <wp:simplePos x="0" y="0"/>
@@ -4593,7 +5857,7 @@
                     </pic:cNvPicPr>
                   </pic:nvPicPr>
                   <pic:blipFill>
-                    <a:blip r:embed="rId14">
+                    <a:blip r:embed="rId16">
                       <a:extLst>
                         <a:ext uri="{28A0092B-C50C-407E-A947-70E740481C1C}">
                           <a14:useLocalDpi xmlns:a14="http://schemas.microsoft.com/office/drawing/2010/main" val="0"/>
@@ -4701,7 +5965,6 @@
           <w:sz w:val="28"/>
           <w:szCs w:val="28"/>
         </w:rPr>
-        <w:lastRenderedPageBreak/>
         <w:t>Attention Visuali</w:t>
       </w:r>
       <w:r>
@@ -4885,6 +6148,7 @@
           <w:sz w:val="28"/>
           <w:szCs w:val="28"/>
         </w:rPr>
+        <w:lastRenderedPageBreak/>
         <w:t xml:space="preserve">Manual Review – </w:t>
       </w:r>
       <w:r>
@@ -4910,7 +6174,7 @@
           <w:szCs w:val="40"/>
         </w:rPr>
       </w:pPr>
-      <w:bookmarkStart w:id="24" w:name="_Toc215832390"/>
+      <w:bookmarkStart w:id="29" w:name="_Toc216749843"/>
       <w:r>
         <w:rPr>
           <w:sz w:val="40"/>
@@ -4933,7 +6197,7 @@
         </w:rPr>
         <w:t>DistilBERT</w:t>
       </w:r>
-      <w:bookmarkEnd w:id="24"/>
+      <w:bookmarkEnd w:id="29"/>
       <w:proofErr w:type="spellEnd"/>
       <w:r>
         <w:rPr>
@@ -5108,13 +6372,113 @@
     </w:p>
     <w:p>
       <w:pPr>
+        <w:rPr>
+          <w:b/>
+          <w:bCs/>
+          <w:sz w:val="28"/>
+          <w:szCs w:val="28"/>
+        </w:rPr>
+      </w:pPr>
+    </w:p>
+    <w:p>
+      <w:pPr>
+        <w:rPr>
+          <w:b/>
+          <w:bCs/>
+          <w:sz w:val="28"/>
+          <w:szCs w:val="28"/>
+        </w:rPr>
+      </w:pPr>
+    </w:p>
+    <w:p>
+      <w:pPr>
+        <w:rPr>
+          <w:b/>
+          <w:bCs/>
+          <w:sz w:val="28"/>
+          <w:szCs w:val="28"/>
+        </w:rPr>
+      </w:pPr>
+    </w:p>
+    <w:p>
+      <w:pPr>
+        <w:rPr>
+          <w:b/>
+          <w:bCs/>
+          <w:sz w:val="28"/>
+          <w:szCs w:val="28"/>
+        </w:rPr>
+      </w:pPr>
+    </w:p>
+    <w:p>
+      <w:pPr>
+        <w:rPr>
+          <w:b/>
+          <w:bCs/>
+          <w:sz w:val="28"/>
+          <w:szCs w:val="28"/>
+        </w:rPr>
+      </w:pPr>
+    </w:p>
+    <w:p>
+      <w:pPr>
+        <w:rPr>
+          <w:b/>
+          <w:bCs/>
+          <w:sz w:val="28"/>
+          <w:szCs w:val="28"/>
+        </w:rPr>
+      </w:pPr>
+    </w:p>
+    <w:p>
+      <w:pPr>
+        <w:rPr>
+          <w:b/>
+          <w:bCs/>
+          <w:sz w:val="28"/>
+          <w:szCs w:val="28"/>
+        </w:rPr>
+      </w:pPr>
+    </w:p>
+    <w:p>
+      <w:pPr>
+        <w:rPr>
+          <w:b/>
+          <w:bCs/>
+          <w:sz w:val="28"/>
+          <w:szCs w:val="28"/>
+        </w:rPr>
+      </w:pPr>
+    </w:p>
+    <w:p>
+      <w:pPr>
+        <w:rPr>
+          <w:b/>
+          <w:bCs/>
+          <w:sz w:val="28"/>
+          <w:szCs w:val="28"/>
+        </w:rPr>
+      </w:pPr>
+    </w:p>
+    <w:p>
+      <w:pPr>
+        <w:rPr>
+          <w:b/>
+          <w:bCs/>
+          <w:sz w:val="28"/>
+          <w:szCs w:val="28"/>
+        </w:rPr>
+      </w:pPr>
+    </w:p>
+    <w:p>
+      <w:pPr>
         <w:pStyle w:val="Heading1"/>
         <w:rPr>
           <w:sz w:val="40"/>
           <w:szCs w:val="40"/>
         </w:rPr>
       </w:pPr>
-      <w:bookmarkStart w:id="25" w:name="_Toc215832391"/>
+      <w:bookmarkStart w:id="30" w:name="_Toc216749844"/>
       <w:r>
         <w:rPr>
           <w:sz w:val="40"/>
@@ -5123,7 +6487,7 @@
         <w:lastRenderedPageBreak/>
         <w:t>Resources</w:t>
       </w:r>
-      <w:bookmarkEnd w:id="25"/>
+      <w:bookmarkEnd w:id="30"/>
       <w:r>
         <w:rPr>
           <w:sz w:val="40"/>
@@ -5160,7 +6524,7 @@
       <w:r>
         <w:t xml:space="preserve">. </w:t>
       </w:r>
-      <w:hyperlink r:id="rId15" w:history="1">
+      <w:hyperlink r:id="rId17" w:history="1">
         <w:r>
           <w:rPr>
             <w:rStyle w:val="Hyperlink"/>
@@ -5186,7 +6550,7 @@
       <w:r>
         <w:t xml:space="preserve">. (n.d.). IFRC. </w:t>
       </w:r>
-      <w:hyperlink r:id="rId16" w:history="1">
+      <w:hyperlink r:id="rId18" w:history="1">
         <w:r>
           <w:rPr>
             <w:rStyle w:val="Hyperlink"/>
@@ -5212,7 +6576,7 @@
       <w:r>
         <w:t xml:space="preserve">. (2025, November 16). Wikipedia. </w:t>
       </w:r>
-      <w:hyperlink r:id="rId17" w:history="1">
+      <w:hyperlink r:id="rId19" w:history="1">
         <w:r>
           <w:rPr>
             <w:rStyle w:val="Hyperlink"/>
@@ -5238,7 +6602,7 @@
       <w:r>
         <w:t xml:space="preserve">. (n.d.). The Netherlands Red Cross - 510. </w:t>
       </w:r>
-      <w:hyperlink r:id="rId18" w:history="1">
+      <w:hyperlink r:id="rId20" w:history="1">
         <w:r>
           <w:rPr>
             <w:rStyle w:val="Hyperlink"/>
@@ -5280,7 +6644,7 @@
       <w:r>
         <w:t xml:space="preserve">. </w:t>
       </w:r>
-      <w:hyperlink r:id="rId19" w:history="1">
+      <w:hyperlink r:id="rId21" w:history="1">
         <w:r>
           <w:rPr>
             <w:rStyle w:val="Hyperlink"/>
@@ -5322,7 +6686,7 @@
       <w:r>
         <w:t xml:space="preserve">. (2015, April 21). Medium. </w:t>
       </w:r>
-      <w:hyperlink r:id="rId20" w:history="1">
+      <w:hyperlink r:id="rId22" w:history="1">
         <w:r>
           <w:rPr>
             <w:rStyle w:val="Hyperlink"/>
@@ -5356,7 +6720,7 @@
       <w:r>
         <w:t xml:space="preserve"> / Doctors Without Borders. </w:t>
       </w:r>
-      <w:hyperlink r:id="rId21" w:history="1">
+      <w:hyperlink r:id="rId23" w:history="1">
         <w:r>
           <w:rPr>
             <w:rStyle w:val="Hyperlink"/>
@@ -5420,7 +6784,7 @@
         </w:rPr>
         <w:t xml:space="preserve">. </w:t>
       </w:r>
-      <w:hyperlink r:id="rId22" w:history="1">
+      <w:hyperlink r:id="rId24" w:history="1">
         <w:r>
           <w:rPr>
             <w:rStyle w:val="Hyperlink"/>
@@ -5516,7 +6880,7 @@
         </w:rPr>
         <w:t xml:space="preserve">. </w:t>
       </w:r>
-      <w:hyperlink r:id="rId23" w:anchor="S7" w:history="1">
+      <w:hyperlink r:id="rId25" w:anchor="S7" w:history="1">
         <w:r>
           <w:rPr>
             <w:rStyle w:val="Hyperlink"/>
@@ -5586,7 +6950,7 @@
         </w:rPr>
         <w:t xml:space="preserve">. </w:t>
       </w:r>
-      <w:hyperlink r:id="rId24" w:history="1">
+      <w:hyperlink r:id="rId26" w:history="1">
         <w:r>
           <w:rPr>
             <w:rStyle w:val="Hyperlink"/>
@@ -5636,7 +7000,7 @@
         </w:rPr>
         <w:t xml:space="preserve">. </w:t>
       </w:r>
-      <w:hyperlink r:id="rId25" w:history="1">
+      <w:hyperlink r:id="rId27" w:history="1">
         <w:r>
           <w:rPr>
             <w:rStyle w:val="Hyperlink"/>
@@ -5694,7 +7058,7 @@
         </w:rPr>
         <w:t xml:space="preserve">. </w:t>
       </w:r>
-      <w:hyperlink r:id="rId26" w:history="1">
+      <w:hyperlink r:id="rId28" w:history="1">
         <w:r>
           <w:rPr>
             <w:rStyle w:val="Hyperlink"/>
@@ -5716,17 +7080,101 @@
           <w:szCs w:val="24"/>
         </w:rPr>
       </w:pPr>
-    </w:p>
-    <w:p>
-      <w:pPr>
-        <w:spacing w:after="0" w:line="480" w:lineRule="auto"/>
-        <w:ind w:hanging="720"/>
+      <w:proofErr w:type="spellStart"/>
+      <w:r>
         <w:rPr>
           <w:rFonts w:ascii="Times New Roman" w:eastAsia="Times New Roman" w:hAnsi="Times New Roman" w:cs="Times New Roman"/>
           <w:sz w:val="24"/>
           <w:szCs w:val="24"/>
         </w:rPr>
-      </w:pPr>
+        <w:t>Yashaswini</w:t>
+      </w:r>
+      <w:proofErr w:type="spellEnd"/>
+      <w:r>
+        <w:rPr>
+          <w:rFonts w:ascii="Times New Roman" w:eastAsia="Times New Roman" w:hAnsi="Times New Roman" w:cs="Times New Roman"/>
+          <w:sz w:val="24"/>
+          <w:szCs w:val="24"/>
+        </w:rPr>
+        <w:t xml:space="preserve">, S. P. Y. (2025, August 22). Natural Language Processing. </w:t>
+      </w:r>
+      <w:r>
+        <w:rPr>
+          <w:rFonts w:ascii="Times New Roman" w:eastAsia="Times New Roman" w:hAnsi="Times New Roman" w:cs="Times New Roman"/>
+          <w:i/>
+          <w:iCs/>
+          <w:sz w:val="24"/>
+          <w:szCs w:val="24"/>
+        </w:rPr>
+        <w:t>Think201</w:t>
+      </w:r>
+      <w:r>
+        <w:rPr>
+          <w:rFonts w:ascii="Times New Roman" w:eastAsia="Times New Roman" w:hAnsi="Times New Roman" w:cs="Times New Roman"/>
+          <w:sz w:val="24"/>
+          <w:szCs w:val="24"/>
+        </w:rPr>
+        <w:t xml:space="preserve">. </w:t>
+      </w:r>
+      <w:hyperlink r:id="rId29" w:history="1">
+        <w:r>
+          <w:rPr>
+            <w:rStyle w:val="Hyperlink"/>
+            <w:rFonts w:ascii="Times New Roman" w:eastAsia="Times New Roman" w:hAnsi="Times New Roman" w:cs="Times New Roman"/>
+            <w:sz w:val="24"/>
+            <w:szCs w:val="24"/>
+          </w:rPr>
+          <w:t>https://think201.com/blog/natural-language-processing/</w:t>
+        </w:r>
+      </w:hyperlink>
+    </w:p>
+    <w:p>
+      <w:pPr>
+        <w:spacing w:after="0" w:line="480" w:lineRule="auto"/>
+        <w:ind w:hanging="720"/>
+        <w:rPr>
+          <w:rFonts w:ascii="Times New Roman" w:eastAsia="Times New Roman" w:hAnsi="Times New Roman" w:cs="Times New Roman"/>
+          <w:sz w:val="24"/>
+          <w:szCs w:val="24"/>
+        </w:rPr>
+      </w:pPr>
+      <w:r>
+        <w:rPr>
+          <w:rFonts w:ascii="Times New Roman" w:eastAsia="Times New Roman" w:hAnsi="Times New Roman" w:cs="Times New Roman"/>
+          <w:sz w:val="24"/>
+          <w:szCs w:val="24"/>
+        </w:rPr>
+        <w:t xml:space="preserve">Wang, Y. W., Yue, S. Y., &amp; Zhong, Y. Z. (n.d.). Understanding Differences Between Human Language Processing and Natural Language Processing by the Synchronized Model. In </w:t>
+      </w:r>
+      <w:r>
+        <w:rPr>
+          <w:rFonts w:ascii="Times New Roman" w:eastAsia="Times New Roman" w:hAnsi="Times New Roman" w:cs="Times New Roman"/>
+          <w:i/>
+          <w:iCs/>
+          <w:sz w:val="24"/>
+          <w:szCs w:val="24"/>
+        </w:rPr>
+        <w:t>Atlantis Press</w:t>
+      </w:r>
+      <w:r>
+        <w:rPr>
+          <w:rFonts w:ascii="Times New Roman" w:eastAsia="Times New Roman" w:hAnsi="Times New Roman" w:cs="Times New Roman"/>
+          <w:sz w:val="24"/>
+          <w:szCs w:val="24"/>
+        </w:rPr>
+        <w:t xml:space="preserve">. </w:t>
+      </w:r>
+      <w:hyperlink r:id="rId30" w:history="1">
+        <w:r>
+          <w:rPr>
+            <w:rStyle w:val="Hyperlink"/>
+            <w:rFonts w:ascii="Times New Roman" w:eastAsia="Times New Roman" w:hAnsi="Times New Roman" w:cs="Times New Roman"/>
+            <w:sz w:val="24"/>
+            <w:szCs w:val="24"/>
+          </w:rPr>
+          <w:t>https://share.google/8BtYYqNAzbzI38C3p</w:t>
+        </w:r>
+      </w:hyperlink>
     </w:p>
     <w:p>
       <w:pPr>
@@ -5754,6 +7202,232 @@
 <file path=word/numbering.xml><?xml version="1.0" encoding="utf-8"?>
 <w:numbering xmlns:wpc="http://schemas.microsoft.com/office/word/2010/wordprocessingCanvas" xmlns:cx="http://schemas.microsoft.com/office/drawing/2014/chartex" xmlns:cx1="http://schemas.microsoft.com/office/drawing/2015/9/8/chartex" xmlns:cx2="http://schemas.microsoft.com/office/drawing/2015/10/21/chartex" xmlns:cx3="http://schemas.microsoft.com/office/drawing/2016/5/9/chartex" xmlns:cx4="http://schemas.microsoft.com/office/drawing/2016/5/10/chartex" xmlns:cx5="http://schemas.microsoft.com/office/drawing/2016/5/11/chartex" xmlns:cx6="http://schemas.microsoft.com/office/drawing/2016/5/12/chartex" xmlns:cx7="http://schemas.microsoft.com/office/drawing/2016/5/13/chartex" xmlns:cx8="http://schemas.microsoft.com/office/drawing/2016/5/14/chartex" xmlns:mc="http://schemas.openxmlformats.org/markup-compatibility/2006" xmlns:aink="http://schemas.microsoft.com/office/drawing/2016/ink" xmlns:am3d="http://schemas.microsoft.com/office/drawing/2017/model3d" xmlns:o="urn:schemas-microsoft-com:office:office" xmlns:r="http://schemas.openxmlformats.org/officeDocument/2006/relationships" xmlns:m="http://schemas.openxmlformats.org/officeDocument/2006/math" xmlns:v="urn:schemas-microsoft-com:vml" xmlns:wp14="http://schemas.microsoft.com/office/word/2010/wordprocessingDrawing" xmlns:wp="http://schemas.openxmlformats.org/drawingml/2006/wordprocessingDrawing" xmlns:w10="urn:schemas-microsoft-com:office:word" xmlns:w="http://schemas.openxmlformats.org/wordprocessingml/2006/main" xmlns:w14="http://schemas.microsoft.com/office/word/2010/wordml" xmlns:w15="http://schemas.microsoft.com/office/word/2012/wordml" xmlns:w16cex="http://schemas.microsoft.com/office/word/2018/wordml/cex" xmlns:w16cid="http://schemas.microsoft.com/office/word/2016/wordml/cid" xmlns:w16="http://schemas.microsoft.com/office/word/2018/wordml" xmlns:w16sdtdh="http://schemas.microsoft.com/office/word/2020/wordml/sdtdatahash" xmlns:w16se="http://schemas.microsoft.com/office/word/2015/wordml/symex" xmlns:wpg="http://schemas.microsoft.com/office/word/2010/wordprocessingGroup" xmlns:wpi="http://schemas.microsoft.com/office/word/2010/wordprocessingInk" xmlns:wne="http://schemas.microsoft.com/office/word/2006/wordml" xmlns:wps="http://schemas.microsoft.com/office/word/2010/wordprocessingShape" mc:Ignorable="w14 w15 w16se w16cid w16 w16cex w16sdtdh wp14">
   <w:abstractNum w:abstractNumId="0" w15:restartNumberingAfterBreak="0">
+    <w:nsid w:val="1A666E99"/>
+    <w:multiLevelType w:val="hybridMultilevel"/>
+    <w:tmpl w:val="886AB986"/>
+    <w:lvl w:ilvl="0" w:tplc="04090001">
+      <w:start w:val="1"/>
+      <w:numFmt w:val="bullet"/>
+      <w:lvlText w:val=""/>
+      <w:lvlJc w:val="left"/>
+      <w:pPr>
+        <w:ind w:left="720" w:hanging="360"/>
+      </w:pPr>
+      <w:rPr>
+        <w:rFonts w:ascii="Symbol" w:hAnsi="Symbol" w:hint="default"/>
+      </w:rPr>
+    </w:lvl>
+    <w:lvl w:ilvl="1" w:tplc="04090003" w:tentative="1">
+      <w:start w:val="1"/>
+      <w:numFmt w:val="bullet"/>
+      <w:lvlText w:val="o"/>
+      <w:lvlJc w:val="left"/>
+      <w:pPr>
+        <w:ind w:left="1440" w:hanging="360"/>
+      </w:pPr>
+      <w:rPr>
+        <w:rFonts w:ascii="Courier New" w:hAnsi="Courier New" w:cs="Courier New" w:hint="default"/>
+      </w:rPr>
+    </w:lvl>
+    <w:lvl w:ilvl="2" w:tplc="04090005" w:tentative="1">
+      <w:start w:val="1"/>
+      <w:numFmt w:val="bullet"/>
+      <w:lvlText w:val=""/>
+      <w:lvlJc w:val="left"/>
+      <w:pPr>
+        <w:ind w:left="2160" w:hanging="360"/>
+      </w:pPr>
+      <w:rPr>
+        <w:rFonts w:ascii="Wingdings" w:hAnsi="Wingdings" w:hint="default"/>
+      </w:rPr>
+    </w:lvl>
+    <w:lvl w:ilvl="3" w:tplc="04090001" w:tentative="1">
+      <w:start w:val="1"/>
+      <w:numFmt w:val="bullet"/>
+      <w:lvlText w:val=""/>
+      <w:lvlJc w:val="left"/>
+      <w:pPr>
+        <w:ind w:left="2880" w:hanging="360"/>
+      </w:pPr>
+      <w:rPr>
+        <w:rFonts w:ascii="Symbol" w:hAnsi="Symbol" w:hint="default"/>
+      </w:rPr>
+    </w:lvl>
+    <w:lvl w:ilvl="4" w:tplc="04090003" w:tentative="1">
+      <w:start w:val="1"/>
+      <w:numFmt w:val="bullet"/>
+      <w:lvlText w:val="o"/>
+      <w:lvlJc w:val="left"/>
+      <w:pPr>
+        <w:ind w:left="3600" w:hanging="360"/>
+      </w:pPr>
+      <w:rPr>
+        <w:rFonts w:ascii="Courier New" w:hAnsi="Courier New" w:cs="Courier New" w:hint="default"/>
+      </w:rPr>
+    </w:lvl>
+    <w:lvl w:ilvl="5" w:tplc="04090005" w:tentative="1">
+      <w:start w:val="1"/>
+      <w:numFmt w:val="bullet"/>
+      <w:lvlText w:val=""/>
+      <w:lvlJc w:val="left"/>
+      <w:pPr>
+        <w:ind w:left="4320" w:hanging="360"/>
+      </w:pPr>
+      <w:rPr>
+        <w:rFonts w:ascii="Wingdings" w:hAnsi="Wingdings" w:hint="default"/>
+      </w:rPr>
+    </w:lvl>
+    <w:lvl w:ilvl="6" w:tplc="04090001" w:tentative="1">
+      <w:start w:val="1"/>
+      <w:numFmt w:val="bullet"/>
+      <w:lvlText w:val=""/>
+      <w:lvlJc w:val="left"/>
+      <w:pPr>
+        <w:ind w:left="5040" w:hanging="360"/>
+      </w:pPr>
+      <w:rPr>
+        <w:rFonts w:ascii="Symbol" w:hAnsi="Symbol" w:hint="default"/>
+      </w:rPr>
+    </w:lvl>
+    <w:lvl w:ilvl="7" w:tplc="04090003" w:tentative="1">
+      <w:start w:val="1"/>
+      <w:numFmt w:val="bullet"/>
+      <w:lvlText w:val="o"/>
+      <w:lvlJc w:val="left"/>
+      <w:pPr>
+        <w:ind w:left="5760" w:hanging="360"/>
+      </w:pPr>
+      <w:rPr>
+        <w:rFonts w:ascii="Courier New" w:hAnsi="Courier New" w:cs="Courier New" w:hint="default"/>
+      </w:rPr>
+    </w:lvl>
+    <w:lvl w:ilvl="8" w:tplc="04090005" w:tentative="1">
+      <w:start w:val="1"/>
+      <w:numFmt w:val="bullet"/>
+      <w:lvlText w:val=""/>
+      <w:lvlJc w:val="left"/>
+      <w:pPr>
+        <w:ind w:left="6480" w:hanging="360"/>
+      </w:pPr>
+      <w:rPr>
+        <w:rFonts w:ascii="Wingdings" w:hAnsi="Wingdings" w:hint="default"/>
+      </w:rPr>
+    </w:lvl>
+  </w:abstractNum>
+  <w:abstractNum w:abstractNumId="1" w15:restartNumberingAfterBreak="0">
+    <w:nsid w:val="1C4B29D8"/>
+    <w:multiLevelType w:val="hybridMultilevel"/>
+    <w:tmpl w:val="F970F90C"/>
+    <w:lvl w:ilvl="0" w:tplc="04090001">
+      <w:start w:val="1"/>
+      <w:numFmt w:val="bullet"/>
+      <w:lvlText w:val=""/>
+      <w:lvlJc w:val="left"/>
+      <w:pPr>
+        <w:ind w:left="720" w:hanging="360"/>
+      </w:pPr>
+      <w:rPr>
+        <w:rFonts w:ascii="Symbol" w:hAnsi="Symbol" w:hint="default"/>
+      </w:rPr>
+    </w:lvl>
+    <w:lvl w:ilvl="1" w:tplc="04090003" w:tentative="1">
+      <w:start w:val="1"/>
+      <w:numFmt w:val="bullet"/>
+      <w:lvlText w:val="o"/>
+      <w:lvlJc w:val="left"/>
+      <w:pPr>
+        <w:ind w:left="1440" w:hanging="360"/>
+      </w:pPr>
+      <w:rPr>
+        <w:rFonts w:ascii="Courier New" w:hAnsi="Courier New" w:cs="Courier New" w:hint="default"/>
+      </w:rPr>
+    </w:lvl>
+    <w:lvl w:ilvl="2" w:tplc="04090005" w:tentative="1">
+      <w:start w:val="1"/>
+      <w:numFmt w:val="bullet"/>
+      <w:lvlText w:val=""/>
+      <w:lvlJc w:val="left"/>
+      <w:pPr>
+        <w:ind w:left="2160" w:hanging="360"/>
+      </w:pPr>
+      <w:rPr>
+        <w:rFonts w:ascii="Wingdings" w:hAnsi="Wingdings" w:hint="default"/>
+      </w:rPr>
+    </w:lvl>
+    <w:lvl w:ilvl="3" w:tplc="04090001" w:tentative="1">
+      <w:start w:val="1"/>
+      <w:numFmt w:val="bullet"/>
+      <w:lvlText w:val=""/>
+      <w:lvlJc w:val="left"/>
+      <w:pPr>
+        <w:ind w:left="2880" w:hanging="360"/>
+      </w:pPr>
+      <w:rPr>
+        <w:rFonts w:ascii="Symbol" w:hAnsi="Symbol" w:hint="default"/>
+      </w:rPr>
+    </w:lvl>
+    <w:lvl w:ilvl="4" w:tplc="04090003" w:tentative="1">
+      <w:start w:val="1"/>
+      <w:numFmt w:val="bullet"/>
+      <w:lvlText w:val="o"/>
+      <w:lvlJc w:val="left"/>
+      <w:pPr>
+        <w:ind w:left="3600" w:hanging="360"/>
+      </w:pPr>
+      <w:rPr>
+        <w:rFonts w:ascii="Courier New" w:hAnsi="Courier New" w:cs="Courier New" w:hint="default"/>
+      </w:rPr>
+    </w:lvl>
+    <w:lvl w:ilvl="5" w:tplc="04090005" w:tentative="1">
+      <w:start w:val="1"/>
+      <w:numFmt w:val="bullet"/>
+      <w:lvlText w:val=""/>
+      <w:lvlJc w:val="left"/>
+      <w:pPr>
+        <w:ind w:left="4320" w:hanging="360"/>
+      </w:pPr>
+      <w:rPr>
+        <w:rFonts w:ascii="Wingdings" w:hAnsi="Wingdings" w:hint="default"/>
+      </w:rPr>
+    </w:lvl>
+    <w:lvl w:ilvl="6" w:tplc="04090001" w:tentative="1">
+      <w:start w:val="1"/>
+      <w:numFmt w:val="bullet"/>
+      <w:lvlText w:val=""/>
+      <w:lvlJc w:val="left"/>
+      <w:pPr>
+        <w:ind w:left="5040" w:hanging="360"/>
+      </w:pPr>
+      <w:rPr>
+        <w:rFonts w:ascii="Symbol" w:hAnsi="Symbol" w:hint="default"/>
+      </w:rPr>
+    </w:lvl>
+    <w:lvl w:ilvl="7" w:tplc="04090003" w:tentative="1">
+      <w:start w:val="1"/>
+      <w:numFmt w:val="bullet"/>
+      <w:lvlText w:val="o"/>
+      <w:lvlJc w:val="left"/>
+      <w:pPr>
+        <w:ind w:left="5760" w:hanging="360"/>
+      </w:pPr>
+      <w:rPr>
+        <w:rFonts w:ascii="Courier New" w:hAnsi="Courier New" w:cs="Courier New" w:hint="default"/>
+      </w:rPr>
+    </w:lvl>
+    <w:lvl w:ilvl="8" w:tplc="04090005" w:tentative="1">
+      <w:start w:val="1"/>
+      <w:numFmt w:val="bullet"/>
+      <w:lvlText w:val=""/>
+      <w:lvlJc w:val="left"/>
+      <w:pPr>
+        <w:ind w:left="6480" w:hanging="360"/>
+      </w:pPr>
+      <w:rPr>
+        <w:rFonts w:ascii="Wingdings" w:hAnsi="Wingdings" w:hint="default"/>
+      </w:rPr>
+    </w:lvl>
+  </w:abstractNum>
+  <w:abstractNum w:abstractNumId="2" w15:restartNumberingAfterBreak="0">
     <w:nsid w:val="2FA20839"/>
     <w:multiLevelType w:val="multilevel"/>
     <w:tmpl w:val="04090021"/>
@@ -5866,7 +7540,7 @@
       </w:rPr>
     </w:lvl>
   </w:abstractNum>
-  <w:abstractNum w:abstractNumId="1" w15:restartNumberingAfterBreak="0">
+  <w:abstractNum w:abstractNumId="3" w15:restartNumberingAfterBreak="0">
     <w:nsid w:val="35BD46BC"/>
     <w:multiLevelType w:val="hybridMultilevel"/>
     <w:tmpl w:val="AA0C330C"/>
@@ -5979,7 +7653,7 @@
       </w:rPr>
     </w:lvl>
   </w:abstractNum>
-  <w:abstractNum w:abstractNumId="2" w15:restartNumberingAfterBreak="0">
+  <w:abstractNum w:abstractNumId="4" w15:restartNumberingAfterBreak="0">
     <w:nsid w:val="386831BD"/>
     <w:multiLevelType w:val="hybridMultilevel"/>
     <w:tmpl w:val="D358804C"/>
@@ -6065,7 +7739,7 @@
       </w:pPr>
     </w:lvl>
   </w:abstractNum>
-  <w:abstractNum w:abstractNumId="3" w15:restartNumberingAfterBreak="0">
+  <w:abstractNum w:abstractNumId="5" w15:restartNumberingAfterBreak="0">
     <w:nsid w:val="39E67A20"/>
     <w:multiLevelType w:val="hybridMultilevel"/>
     <w:tmpl w:val="E82C6424"/>
@@ -6151,7 +7825,7 @@
       </w:pPr>
     </w:lvl>
   </w:abstractNum>
-  <w:abstractNum w:abstractNumId="4" w15:restartNumberingAfterBreak="0">
+  <w:abstractNum w:abstractNumId="6" w15:restartNumberingAfterBreak="0">
     <w:nsid w:val="436708F3"/>
     <w:multiLevelType w:val="hybridMultilevel"/>
     <w:tmpl w:val="2604D006"/>
@@ -6264,7 +7938,7 @@
       </w:rPr>
     </w:lvl>
   </w:abstractNum>
-  <w:abstractNum w:abstractNumId="5" w15:restartNumberingAfterBreak="0">
+  <w:abstractNum w:abstractNumId="7" w15:restartNumberingAfterBreak="0">
     <w:nsid w:val="4B8906CC"/>
     <w:multiLevelType w:val="hybridMultilevel"/>
     <w:tmpl w:val="DFFC6858"/>
@@ -6377,7 +8051,7 @@
       </w:rPr>
     </w:lvl>
   </w:abstractNum>
-  <w:abstractNum w:abstractNumId="6" w15:restartNumberingAfterBreak="0">
+  <w:abstractNum w:abstractNumId="8" w15:restartNumberingAfterBreak="0">
     <w:nsid w:val="4FB47298"/>
     <w:multiLevelType w:val="hybridMultilevel"/>
     <w:tmpl w:val="E8B06D14"/>
@@ -6490,7 +8164,7 @@
       </w:rPr>
     </w:lvl>
   </w:abstractNum>
-  <w:abstractNum w:abstractNumId="7" w15:restartNumberingAfterBreak="0">
+  <w:abstractNum w:abstractNumId="9" w15:restartNumberingAfterBreak="0">
     <w:nsid w:val="5ED96AAC"/>
     <w:multiLevelType w:val="hybridMultilevel"/>
     <w:tmpl w:val="3142FE1A"/>
@@ -6603,7 +8277,7 @@
       </w:rPr>
     </w:lvl>
   </w:abstractNum>
-  <w:abstractNum w:abstractNumId="8" w15:restartNumberingAfterBreak="0">
+  <w:abstractNum w:abstractNumId="10" w15:restartNumberingAfterBreak="0">
     <w:nsid w:val="66BF06C1"/>
     <w:multiLevelType w:val="hybridMultilevel"/>
     <w:tmpl w:val="81367ADE"/>
@@ -6689,7 +8363,7 @@
       </w:pPr>
     </w:lvl>
   </w:abstractNum>
-  <w:abstractNum w:abstractNumId="9" w15:restartNumberingAfterBreak="0">
+  <w:abstractNum w:abstractNumId="11" w15:restartNumberingAfterBreak="0">
     <w:nsid w:val="67057AF3"/>
     <w:multiLevelType w:val="hybridMultilevel"/>
     <w:tmpl w:val="16FAD83C"/>
@@ -6802,7 +8476,7 @@
       </w:rPr>
     </w:lvl>
   </w:abstractNum>
-  <w:abstractNum w:abstractNumId="10" w15:restartNumberingAfterBreak="0">
+  <w:abstractNum w:abstractNumId="12" w15:restartNumberingAfterBreak="0">
     <w:nsid w:val="6C456F44"/>
     <w:multiLevelType w:val="hybridMultilevel"/>
     <w:tmpl w:val="AB5C7DCE"/>
@@ -6888,7 +8562,7 @@
       </w:pPr>
     </w:lvl>
   </w:abstractNum>
-  <w:abstractNum w:abstractNumId="11" w15:restartNumberingAfterBreak="0">
+  <w:abstractNum w:abstractNumId="13" w15:restartNumberingAfterBreak="0">
     <w:nsid w:val="6D0C34C1"/>
     <w:multiLevelType w:val="hybridMultilevel"/>
     <w:tmpl w:val="1F4AA3EA"/>
@@ -7001,7 +8675,7 @@
       </w:rPr>
     </w:lvl>
   </w:abstractNum>
-  <w:abstractNum w:abstractNumId="12" w15:restartNumberingAfterBreak="0">
+  <w:abstractNum w:abstractNumId="14" w15:restartNumberingAfterBreak="0">
     <w:nsid w:val="6EB90CF7"/>
     <w:multiLevelType w:val="hybridMultilevel"/>
     <w:tmpl w:val="3508EC3C"/>
@@ -7114,7 +8788,7 @@
       </w:rPr>
     </w:lvl>
   </w:abstractNum>
-  <w:abstractNum w:abstractNumId="13" w15:restartNumberingAfterBreak="0">
+  <w:abstractNum w:abstractNumId="15" w15:restartNumberingAfterBreak="0">
     <w:nsid w:val="72A16988"/>
     <w:multiLevelType w:val="hybridMultilevel"/>
     <w:tmpl w:val="9EF4A8E0"/>
@@ -7227,7 +8901,7 @@
       </w:rPr>
     </w:lvl>
   </w:abstractNum>
-  <w:abstractNum w:abstractNumId="14" w15:restartNumberingAfterBreak="0">
+  <w:abstractNum w:abstractNumId="16" w15:restartNumberingAfterBreak="0">
     <w:nsid w:val="72D52E1E"/>
     <w:multiLevelType w:val="hybridMultilevel"/>
     <w:tmpl w:val="BCD6ED8C"/>
@@ -7340,7 +9014,7 @@
       </w:rPr>
     </w:lvl>
   </w:abstractNum>
-  <w:abstractNum w:abstractNumId="15" w15:restartNumberingAfterBreak="0">
+  <w:abstractNum w:abstractNumId="17" w15:restartNumberingAfterBreak="0">
     <w:nsid w:val="7BB75D13"/>
     <w:multiLevelType w:val="hybridMultilevel"/>
     <w:tmpl w:val="DA322D4C"/>
@@ -7454,52 +9128,58 @@
     </w:lvl>
   </w:abstractNum>
   <w:num w:numId="1">
+    <w:abstractNumId w:val="7"/>
+  </w:num>
+  <w:num w:numId="2">
+    <w:abstractNumId w:val="10"/>
+  </w:num>
+  <w:num w:numId="3">
+    <w:abstractNumId w:val="15"/>
+  </w:num>
+  <w:num w:numId="4">
     <w:abstractNumId w:val="5"/>
   </w:num>
-  <w:num w:numId="2">
+  <w:num w:numId="5">
+    <w:abstractNumId w:val="12"/>
+  </w:num>
+  <w:num w:numId="6">
+    <w:abstractNumId w:val="11"/>
+  </w:num>
+  <w:num w:numId="7">
+    <w:abstractNumId w:val="16"/>
+  </w:num>
+  <w:num w:numId="8">
+    <w:abstractNumId w:val="13"/>
+  </w:num>
+  <w:num w:numId="9">
+    <w:abstractNumId w:val="2"/>
+  </w:num>
+  <w:num w:numId="10">
+    <w:abstractNumId w:val="4"/>
+  </w:num>
+  <w:num w:numId="11">
+    <w:abstractNumId w:val="3"/>
+  </w:num>
+  <w:num w:numId="12">
+    <w:abstractNumId w:val="9"/>
+  </w:num>
+  <w:num w:numId="13">
     <w:abstractNumId w:val="8"/>
   </w:num>
-  <w:num w:numId="3">
-    <w:abstractNumId w:val="13"/>
+  <w:num w:numId="14">
+    <w:abstractNumId w:val="6"/>
   </w:num>
-  <w:num w:numId="4">
-    <w:abstractNumId w:val="3"/>
-  </w:num>
-  <w:num w:numId="5">
-    <w:abstractNumId w:val="10"/>
-  </w:num>
-  <w:num w:numId="6">
-    <w:abstractNumId w:val="9"/>
-  </w:num>
-  <w:num w:numId="7">
+  <w:num w:numId="15">
     <w:abstractNumId w:val="14"/>
   </w:num>
-  <w:num w:numId="8">
-    <w:abstractNumId w:val="11"/>
+  <w:num w:numId="16">
+    <w:abstractNumId w:val="17"/>
   </w:num>
-  <w:num w:numId="9">
-    <w:abstractNumId w:val="0"/>
-  </w:num>
-  <w:num w:numId="10">
-    <w:abstractNumId w:val="2"/>
-  </w:num>
-  <w:num w:numId="11">
+  <w:num w:numId="17">
     <w:abstractNumId w:val="1"/>
   </w:num>
-  <w:num w:numId="12">
-    <w:abstractNumId w:val="7"/>
-  </w:num>
-  <w:num w:numId="13">
-    <w:abstractNumId w:val="6"/>
-  </w:num>
-  <w:num w:numId="14">
-    <w:abstractNumId w:val="4"/>
-  </w:num>
-  <w:num w:numId="15">
-    <w:abstractNumId w:val="12"/>
-  </w:num>
-  <w:num w:numId="16">
-    <w:abstractNumId w:val="15"/>
+  <w:num w:numId="18">
+    <w:abstractNumId w:val="0"/>
   </w:num>
 </w:numbering>
 </file>

</xml_diff>

<commit_message>
finishing data quality cleaning, applying undersampling on train set, removing URL, email, mention and hashtag tokens, removing locations
</commit_message>
<xml_diff>
--- a/docs/Domian Understanding.docx
+++ b/docs/Domian Understanding.docx
@@ -4260,15 +4260,13 @@
           <w:szCs w:val="40"/>
         </w:rPr>
       </w:pPr>
-      <w:bookmarkStart w:id="16" w:name="_Toc216749830"/>
       <w:r>
         <w:rPr>
           <w:sz w:val="40"/>
           <w:szCs w:val="40"/>
         </w:rPr>
-        <w:t>BERT</w:t>
-      </w:r>
-      <w:bookmarkEnd w:id="16"/>
+        <w:t>Data privacy challenges in LLMs</w:t>
+      </w:r>
     </w:p>
     <w:p>
       <w:pPr>
@@ -4278,30 +4276,62 @@
           <w:szCs w:val="36"/>
         </w:rPr>
       </w:pPr>
-      <w:bookmarkStart w:id="17" w:name="_Toc216749831"/>
       <w:r>
         <w:rPr>
           <w:sz w:val="36"/>
           <w:szCs w:val="36"/>
         </w:rPr>
-        <w:t>What is BERT?</w:t>
-      </w:r>
-      <w:bookmarkEnd w:id="17"/>
-    </w:p>
-    <w:p>
-      <w:pPr>
-        <w:rPr>
-          <w:sz w:val="28"/>
-          <w:szCs w:val="28"/>
-        </w:rPr>
-      </w:pPr>
-      <w:r>
-        <w:rPr>
-          <w:sz w:val="28"/>
-          <w:szCs w:val="28"/>
-        </w:rPr>
-        <w:t xml:space="preserve">BERT is a transformer-based model that uses a stack of encoders to learn the relationships between the words in a sentence. Instead of reading the text from left to right, it goes through the whole text and forms a contextual understanding. </w:t>
-      </w:r>
+        <w:t>Shadow AI</w:t>
+      </w:r>
+    </w:p>
+    <w:p>
+      <w:pPr>
+        <w:rPr>
+          <w:sz w:val="28"/>
+          <w:szCs w:val="28"/>
+        </w:rPr>
+      </w:pPr>
+      <w:r>
+        <w:rPr>
+          <w:sz w:val="28"/>
+          <w:szCs w:val="28"/>
+        </w:rPr>
+        <w:t xml:space="preserve">Shadow IT </w:t>
+      </w:r>
+      <w:r>
+        <w:rPr>
+          <w:sz w:val="28"/>
+          <w:szCs w:val="28"/>
+        </w:rPr>
+        <w:t xml:space="preserve">refers to any tools, apps and services used by the employees of a company, without them being approved by the organization’s IT department. </w:t>
+      </w:r>
+    </w:p>
+    <w:p/>
+    <w:p>
+      <w:pPr>
+        <w:rPr>
+          <w:sz w:val="28"/>
+          <w:szCs w:val="28"/>
+        </w:rPr>
+      </w:pPr>
+    </w:p>
+    <w:p>
+      <w:pPr>
+        <w:pStyle w:val="Heading1"/>
+        <w:rPr>
+          <w:sz w:val="40"/>
+          <w:szCs w:val="40"/>
+        </w:rPr>
+      </w:pPr>
+      <w:bookmarkStart w:id="16" w:name="_Toc216749830"/>
+      <w:r>
+        <w:rPr>
+          <w:sz w:val="40"/>
+          <w:szCs w:val="40"/>
+        </w:rPr>
+        <w:t>BERT</w:t>
+      </w:r>
+      <w:bookmarkEnd w:id="16"/>
     </w:p>
     <w:p>
       <w:pPr>
@@ -4311,12 +4341,46 @@
           <w:szCs w:val="36"/>
         </w:rPr>
       </w:pPr>
-      <w:bookmarkStart w:id="18" w:name="_Toc216749832"/>
+      <w:bookmarkStart w:id="17" w:name="_Toc216749831"/>
       <w:r>
         <w:rPr>
           <w:sz w:val="36"/>
           <w:szCs w:val="36"/>
         </w:rPr>
+        <w:t>What is BERT?</w:t>
+      </w:r>
+      <w:bookmarkEnd w:id="17"/>
+    </w:p>
+    <w:p>
+      <w:pPr>
+        <w:rPr>
+          <w:sz w:val="28"/>
+          <w:szCs w:val="28"/>
+        </w:rPr>
+      </w:pPr>
+      <w:r>
+        <w:rPr>
+          <w:sz w:val="28"/>
+          <w:szCs w:val="28"/>
+        </w:rPr>
+        <w:t xml:space="preserve">BERT is a transformer-based model that uses a stack of encoders to learn the relationships between the words in a sentence. Instead of reading the text from left to right, it goes through the whole text and forms a contextual understanding. </w:t>
+      </w:r>
+    </w:p>
+    <w:p>
+      <w:pPr>
+        <w:pStyle w:val="Heading2"/>
+        <w:rPr>
+          <w:sz w:val="36"/>
+          <w:szCs w:val="36"/>
+        </w:rPr>
+      </w:pPr>
+      <w:bookmarkStart w:id="18" w:name="_Toc216749832"/>
+      <w:r>
+        <w:rPr>
+          <w:sz w:val="36"/>
+          <w:szCs w:val="36"/>
+        </w:rPr>
+        <w:lastRenderedPageBreak/>
         <w:t>BERT-based models</w:t>
       </w:r>
       <w:bookmarkEnd w:id="18"/>
@@ -4425,7 +4489,6 @@
           <w:sz w:val="28"/>
           <w:szCs w:val="28"/>
         </w:rPr>
-        <w:lastRenderedPageBreak/>
         <w:t>ROBERTa</w:t>
       </w:r>
       <w:proofErr w:type="spellEnd"/>
@@ -4710,6 +4773,7 @@
           <w:sz w:val="32"/>
           <w:szCs w:val="32"/>
         </w:rPr>
+        <w:lastRenderedPageBreak/>
         <w:t>Embeddings</w:t>
       </w:r>
       <w:bookmarkEnd w:id="21"/>
@@ -4941,6 +5005,7 @@
         <w:rPr>
           <w:noProof/>
         </w:rPr>
+        <w:lastRenderedPageBreak/>
         <w:drawing>
           <wp:anchor distT="0" distB="0" distL="114300" distR="114300" simplePos="0" relativeHeight="251663360" behindDoc="0" locked="0" layoutInCell="1" allowOverlap="1" wp14:anchorId="753E6F19" wp14:editId="5E42FC53">
             <wp:simplePos x="0" y="0"/>
@@ -5112,114 +5177,121 @@
           <w:sz w:val="28"/>
           <w:szCs w:val="28"/>
         </w:rPr>
+        <w:t xml:space="preserve">Nowadays, the Red Cross provides several methods for people to contact them </w:t>
+      </w:r>
+      <w:r>
+        <w:rPr>
+          <w:sz w:val="28"/>
+          <w:szCs w:val="28"/>
+        </w:rPr>
+        <w:t>–</w:t>
+      </w:r>
+      <w:r>
+        <w:rPr>
+          <w:sz w:val="28"/>
+          <w:szCs w:val="28"/>
+        </w:rPr>
+        <w:t xml:space="preserve"> </w:t>
+      </w:r>
+      <w:r>
+        <w:rPr>
+          <w:sz w:val="28"/>
+          <w:szCs w:val="28"/>
+        </w:rPr>
+        <w:t>website contact forms, telephone hotlines and emails (all differ for each country). On 20</w:t>
+      </w:r>
+      <w:r>
+        <w:rPr>
+          <w:sz w:val="28"/>
+          <w:szCs w:val="28"/>
+          <w:vertAlign w:val="superscript"/>
+        </w:rPr>
+        <w:t>th</w:t>
+      </w:r>
+      <w:r>
+        <w:rPr>
+          <w:sz w:val="28"/>
+          <w:szCs w:val="28"/>
+        </w:rPr>
+        <w:t xml:space="preserve"> April 2025, the American Red Cross opened a new Digital Operations Center, which aims to help the organization use social media to </w:t>
+      </w:r>
+      <w:r>
+        <w:rPr>
+          <w:sz w:val="28"/>
+          <w:szCs w:val="28"/>
+        </w:rPr>
+        <w:t>solve various humanitarian issues. The employees working for the center monitor an average of 5</w:t>
+      </w:r>
+      <w:r>
+        <w:rPr>
+          <w:sz w:val="28"/>
+          <w:szCs w:val="28"/>
+        </w:rPr>
+        <w:t>,</w:t>
+      </w:r>
+      <w:r>
+        <w:rPr>
+          <w:sz w:val="28"/>
+          <w:szCs w:val="28"/>
+        </w:rPr>
+        <w:t xml:space="preserve">000 to </w:t>
+      </w:r>
+      <w:r>
+        <w:rPr>
+          <w:sz w:val="28"/>
+          <w:szCs w:val="28"/>
+        </w:rPr>
+        <w:t>7,</w:t>
+      </w:r>
+      <w:r>
+        <w:rPr>
+          <w:sz w:val="28"/>
+          <w:szCs w:val="28"/>
+        </w:rPr>
+        <w:t xml:space="preserve">000 posts </w:t>
+      </w:r>
+      <w:r>
+        <w:rPr>
+          <w:sz w:val="28"/>
+          <w:szCs w:val="28"/>
+        </w:rPr>
+        <w:t>plus additional ones not related to the organization.</w:t>
+      </w:r>
+      <w:r>
+        <w:rPr>
+          <w:sz w:val="28"/>
+          <w:szCs w:val="28"/>
+        </w:rPr>
+        <w:t xml:space="preserve"> In an interview, the Junior Director of Social Engagement states that their internal team is focused on 4 main tasks – social listening, finding people who need help or information, replying and providing help, storytelling and building long-term relationships. This illustrates how much manual effort is </w:t>
+      </w:r>
+      <w:r>
+        <w:rPr>
+          <w:sz w:val="28"/>
+          <w:szCs w:val="28"/>
+        </w:rPr>
+        <w:t>required right</w:t>
+      </w:r>
+      <w:r>
+        <w:rPr>
+          <w:sz w:val="28"/>
+          <w:szCs w:val="28"/>
+        </w:rPr>
+        <w:t xml:space="preserve"> now</w:t>
+      </w:r>
+      <w:r>
+        <w:rPr>
+          <w:sz w:val="28"/>
+          <w:szCs w:val="28"/>
+        </w:rPr>
+        <w:t xml:space="preserve"> to analyze and interpret social media content and emphasizes the need for an AI </w:t>
+      </w:r>
+      <w:r>
+        <w:rPr>
+          <w:sz w:val="28"/>
+          <w:szCs w:val="28"/>
+        </w:rPr>
         <w:lastRenderedPageBreak/>
-        <w:t xml:space="preserve">Nowadays, the Red Cross provides several methods for people to contact them </w:t>
-      </w:r>
-      <w:r>
-        <w:rPr>
-          <w:sz w:val="28"/>
-          <w:szCs w:val="28"/>
-        </w:rPr>
-        <w:t>–</w:t>
-      </w:r>
-      <w:r>
-        <w:rPr>
-          <w:sz w:val="28"/>
-          <w:szCs w:val="28"/>
-        </w:rPr>
-        <w:t xml:space="preserve"> </w:t>
-      </w:r>
-      <w:r>
-        <w:rPr>
-          <w:sz w:val="28"/>
-          <w:szCs w:val="28"/>
-        </w:rPr>
-        <w:t>website contact forms, telephone hotlines and emails (all differ for each country). On 20</w:t>
-      </w:r>
-      <w:r>
-        <w:rPr>
-          <w:sz w:val="28"/>
-          <w:szCs w:val="28"/>
-          <w:vertAlign w:val="superscript"/>
-        </w:rPr>
-        <w:t>th</w:t>
-      </w:r>
-      <w:r>
-        <w:rPr>
-          <w:sz w:val="28"/>
-          <w:szCs w:val="28"/>
-        </w:rPr>
-        <w:t xml:space="preserve"> April 2025, the American Red Cross opened a new Digital Operations Center, which aims to help the organization use social media to </w:t>
-      </w:r>
-      <w:r>
-        <w:rPr>
-          <w:sz w:val="28"/>
-          <w:szCs w:val="28"/>
-        </w:rPr>
-        <w:t>solve various humanitarian issues. The employees working for the center monitor an average of 5</w:t>
-      </w:r>
-      <w:r>
-        <w:rPr>
-          <w:sz w:val="28"/>
-          <w:szCs w:val="28"/>
-        </w:rPr>
-        <w:t>,</w:t>
-      </w:r>
-      <w:r>
-        <w:rPr>
-          <w:sz w:val="28"/>
-          <w:szCs w:val="28"/>
-        </w:rPr>
-        <w:t xml:space="preserve">000 to </w:t>
-      </w:r>
-      <w:r>
-        <w:rPr>
-          <w:sz w:val="28"/>
-          <w:szCs w:val="28"/>
-        </w:rPr>
-        <w:t>7,</w:t>
-      </w:r>
-      <w:r>
-        <w:rPr>
-          <w:sz w:val="28"/>
-          <w:szCs w:val="28"/>
-        </w:rPr>
-        <w:t xml:space="preserve">000 posts </w:t>
-      </w:r>
-      <w:r>
-        <w:rPr>
-          <w:sz w:val="28"/>
-          <w:szCs w:val="28"/>
-        </w:rPr>
-        <w:t>plus additional ones not related to the organization.</w:t>
-      </w:r>
-      <w:r>
-        <w:rPr>
-          <w:sz w:val="28"/>
-          <w:szCs w:val="28"/>
-        </w:rPr>
-        <w:t xml:space="preserve"> In an interview, the Junior Director of Social Engagement states that their internal team is focused on 4 main tasks – social listening, finding people who need help or information, replying and providing help, storytelling and building long-term relationships. This illustrates how much manual effort is </w:t>
-      </w:r>
-      <w:r>
-        <w:rPr>
-          <w:sz w:val="28"/>
-          <w:szCs w:val="28"/>
-        </w:rPr>
-        <w:t>required right</w:t>
-      </w:r>
-      <w:r>
-        <w:rPr>
-          <w:sz w:val="28"/>
-          <w:szCs w:val="28"/>
-        </w:rPr>
-        <w:t xml:space="preserve"> now</w:t>
-      </w:r>
-      <w:r>
-        <w:rPr>
-          <w:sz w:val="28"/>
-          <w:szCs w:val="28"/>
-        </w:rPr>
-        <w:t xml:space="preserve"> to analyze and interpret social media content and emphasizes the need for an AI solution that can classify messages, allowing staff to focus their time and effort on the crucial cases. </w:t>
+        <w:t xml:space="preserve">solution that can classify messages, allowing staff to focus their time and effort on the crucial cases. </w:t>
       </w:r>
     </w:p>
     <w:p>
@@ -5351,15 +5423,7 @@
           <w:sz w:val="28"/>
           <w:szCs w:val="28"/>
         </w:rPr>
-        <w:t xml:space="preserve">, independent medical humanitarian organization. MSF provides medical help to individuals affected by conflicts, disasters, epidemics or exclusion from healthcare. Currently, their team consists of more than 67,000 professionals </w:t>
-      </w:r>
-      <w:r>
-        <w:rPr>
-          <w:sz w:val="28"/>
-          <w:szCs w:val="28"/>
-        </w:rPr>
-        <w:lastRenderedPageBreak/>
-        <w:t>from the medical, logistics, administration, communication and skilled trades fields</w:t>
+        <w:t>, independent medical humanitarian organization. MSF provides medical help to individuals affected by conflicts, disasters, epidemics or exclusion from healthcare. Currently, their team consists of more than 67,000 professionals from the medical, logistics, administration, communication and skilled trades fields</w:t>
       </w:r>
       <w:r>
         <w:rPr>
@@ -5418,6 +5482,7 @@
         <w:rPr>
           <w:noProof/>
         </w:rPr>
+        <w:lastRenderedPageBreak/>
         <w:drawing>
           <wp:anchor distT="0" distB="0" distL="114300" distR="114300" simplePos="0" relativeHeight="251664384" behindDoc="0" locked="0" layoutInCell="1" allowOverlap="1" wp14:anchorId="1ACE94BD" wp14:editId="0461A31B">
             <wp:simplePos x="0" y="0"/>
@@ -5543,7 +5608,6 @@
           <w:sz w:val="36"/>
           <w:szCs w:val="36"/>
         </w:rPr>
-        <w:lastRenderedPageBreak/>
         <w:t xml:space="preserve">Red Cross </w:t>
       </w:r>
       <w:r>
@@ -5756,7 +5820,15 @@
           <w:sz w:val="28"/>
           <w:szCs w:val="28"/>
         </w:rPr>
-        <w:t xml:space="preserve">due to their complexity, they are often referred to as black boxes. </w:t>
+        <w:t xml:space="preserve">due to their complexity, they are often </w:t>
+      </w:r>
+      <w:r>
+        <w:rPr>
+          <w:sz w:val="28"/>
+          <w:szCs w:val="28"/>
+        </w:rPr>
+        <w:lastRenderedPageBreak/>
+        <w:t xml:space="preserve">referred to as black boxes. </w:t>
       </w:r>
       <w:proofErr w:type="spellStart"/>
       <w:r>
@@ -5830,7 +5902,6 @@
         <w:rPr>
           <w:noProof/>
         </w:rPr>
-        <w:lastRenderedPageBreak/>
         <w:drawing>
           <wp:anchor distT="0" distB="0" distL="114300" distR="114300" simplePos="0" relativeHeight="251666432" behindDoc="0" locked="0" layoutInCell="1" allowOverlap="1" wp14:anchorId="1FB1DDCC" wp14:editId="6DEA8387">
             <wp:simplePos x="0" y="0"/>
@@ -5965,6 +6036,7 @@
           <w:sz w:val="28"/>
           <w:szCs w:val="28"/>
         </w:rPr>
+        <w:lastRenderedPageBreak/>
         <w:t>Attention Visuali</w:t>
       </w:r>
       <w:r>
@@ -6148,7 +6220,6 @@
           <w:sz w:val="28"/>
           <w:szCs w:val="28"/>
         </w:rPr>
-        <w:lastRenderedPageBreak/>
         <w:t xml:space="preserve">Manual Review – </w:t>
       </w:r>
       <w:r>
@@ -6484,7 +6555,6 @@
           <w:sz w:val="40"/>
           <w:szCs w:val="40"/>
         </w:rPr>
-        <w:lastRenderedPageBreak/>
         <w:t>Resources</w:t>
       </w:r>
       <w:bookmarkEnd w:id="30"/>
@@ -6707,6 +6777,7 @@
           <w:i/>
           <w:iCs/>
         </w:rPr>
+        <w:lastRenderedPageBreak/>
         <w:t>MSF URGENT MEDICAL RESPONSE</w:t>
       </w:r>
       <w:r>
@@ -6909,7 +6980,6 @@
           <w:sz w:val="24"/>
           <w:szCs w:val="24"/>
         </w:rPr>
-        <w:lastRenderedPageBreak/>
         <w:t xml:space="preserve">Chatterjee, A. C. (2025, October 9). </w:t>
       </w:r>
       <w:proofErr w:type="spellStart"/>

</xml_diff>